<commit_message>
feat: add grading criteria pages and lab document generation scripts
- Implement dedicated grading criteria pages with hash routing support
- Add Lua filter and Pandoc template generator for lab .docx file creation
- Enhance roadmap navigation with course grading criteria links
- Update related content and hooks to include grading criteria functionality
- Refactor metadata and styling for lab descriptions and theoretical notes
</commit_message>
<xml_diff>
--- a/public/labs/os/Критерії_оцінювання_ОС.docx
+++ b/public/labs/os/Критерії_оцінювання_ОС.docx
@@ -34,6 +34,7 @@
           <w:ilvl w:val="0"/>
           <w:numId w:val="1001"/>
         </w:numPr>
+        <w:jc w:val="both"/>
       </w:pPr>
       <w:r>
         <w:t xml:space="preserve">усі пункти порядку виконання роботи виконано в повному обсязі, жодного не пропущено;</w:t>
@@ -46,6 +47,7 @@
           <w:ilvl w:val="0"/>
           <w:numId w:val="1001"/>
         </w:numPr>
+        <w:jc w:val="both"/>
       </w:pPr>
       <w:r>
         <w:t xml:space="preserve">завдання індивідуального варіанта виконано правильно; постановка задачі описана, вхідні та вихідні дані визначені;</w:t>
@@ -58,6 +60,7 @@
           <w:ilvl w:val="0"/>
           <w:numId w:val="1001"/>
         </w:numPr>
+        <w:jc w:val="both"/>
       </w:pPr>
       <w:r>
         <w:t xml:space="preserve">усі дії виконано тим способом, який передбачає робота, — командним рядком, командним файлом або сценарієм; графічний інтерфейс використано лише там, де це прямо зазначено в завданні;</w:t>
@@ -70,6 +73,7 @@
           <w:ilvl w:val="0"/>
           <w:numId w:val="1001"/>
         </w:numPr>
+        <w:jc w:val="both"/>
       </w:pPr>
       <w:r>
         <w:t xml:space="preserve">команди, командні файли та сценарії:</w:t>
@@ -82,6 +86,7 @@
           <w:ilvl w:val="1"/>
           <w:numId w:val="1002"/>
         </w:numPr>
+        <w:jc w:val="both"/>
       </w:pPr>
       <w:r>
         <w:t xml:space="preserve">виконуються без помилок і дають передбачений результат;</w:t>
@@ -94,6 +99,7 @@
           <w:ilvl w:val="1"/>
           <w:numId w:val="1002"/>
         </w:numPr>
+        <w:jc w:val="both"/>
       </w:pPr>
       <w:r>
         <w:t xml:space="preserve">містять перевірку вхідних даних і повідомлення про помилки, якщо це передбачено роботою;</w:t>
@@ -106,6 +112,7 @@
           <w:ilvl w:val="1"/>
           <w:numId w:val="1002"/>
         </w:numPr>
+        <w:jc w:val="both"/>
       </w:pPr>
       <w:r>
         <w:t xml:space="preserve">структуровані, з коментарями, зі змістовними іменами файлів, каталогів і змінних;</w:t>
@@ -118,6 +125,7 @@
           <w:ilvl w:val="0"/>
           <w:numId w:val="1001"/>
         </w:numPr>
+        <w:jc w:val="both"/>
       </w:pPr>
       <w:r>
         <w:t xml:space="preserve">проведено тестування з коректними і завідомо некоректними даними; наведено реакцію системи в обох випадках;</w:t>
@@ -130,6 +138,7 @@
           <w:ilvl w:val="0"/>
           <w:numId w:val="1001"/>
         </w:numPr>
+        <w:jc w:val="both"/>
       </w:pPr>
       <w:r>
         <w:t xml:space="preserve">результат кожного етапу підтверджено знімком екрана або виводом команди;</w:t>
@@ -142,6 +151,7 @@
           <w:ilvl w:val="0"/>
           <w:numId w:val="1001"/>
         </w:numPr>
+        <w:jc w:val="both"/>
       </w:pPr>
       <w:r>
         <w:t xml:space="preserve">студент пояснює призначення кожної виконаної команди і пов’язує отриманий результат із теоретичним матеріалом теми — ядром, процесами, режимами роботи процесора, файловою системою або правами доступу, залежно від змісту роботи;</w:t>
@@ -154,6 +164,7 @@
           <w:ilvl w:val="0"/>
           <w:numId w:val="1001"/>
         </w:numPr>
+        <w:jc w:val="both"/>
       </w:pPr>
       <w:r>
         <w:t xml:space="preserve">звіт оформлений повністю на бланку встановленого зразка: тема, мета, обладнання, постановка задачі, хід роботи з переліком команд і поясненням призначення кожної, знімки екрана, відповіді на контрольні запитання;</w:t>
@@ -166,6 +177,7 @@
           <w:ilvl w:val="0"/>
           <w:numId w:val="1001"/>
         </w:numPr>
+        <w:jc w:val="both"/>
       </w:pPr>
       <w:r>
         <w:t xml:space="preserve">зроблено змістовний висновок, який спирається на власні результати, а не переказує теорію;</w:t>
@@ -178,6 +190,7 @@
           <w:ilvl w:val="0"/>
           <w:numId w:val="1001"/>
         </w:numPr>
+        <w:jc w:val="both"/>
       </w:pPr>
       <w:r>
         <w:t xml:space="preserve">на захисті студент упевнено відповідає на контрольні запитання і на вимогу викладача повторює будь-яку дію з роботи.</w:t>
@@ -208,6 +221,7 @@
           <w:ilvl w:val="0"/>
           <w:numId w:val="1003"/>
         </w:numPr>
+        <w:jc w:val="both"/>
       </w:pPr>
       <w:r>
         <w:t xml:space="preserve">усі основні пункти виконано, пропущено окремі другорядні;</w:t>
@@ -220,6 +234,7 @@
           <w:ilvl w:val="0"/>
           <w:numId w:val="1003"/>
         </w:numPr>
+        <w:jc w:val="both"/>
       </w:pPr>
       <w:r>
         <w:t xml:space="preserve">завдання індивідуального варіанта виконано, проте постановка задачі описана без повної деталізації;</w:t>
@@ -232,6 +247,7 @@
           <w:ilvl w:val="0"/>
           <w:numId w:val="1003"/>
         </w:numPr>
+        <w:jc w:val="both"/>
       </w:pPr>
       <w:r>
         <w:t xml:space="preserve">окремі дії виконано засобами графічного інтерфейсу там, де передбачався командний рядок;</w:t>
@@ -244,6 +260,7 @@
           <w:ilvl w:val="0"/>
           <w:numId w:val="1003"/>
         </w:numPr>
+        <w:jc w:val="both"/>
       </w:pPr>
       <w:r>
         <w:t xml:space="preserve">команди, командні файли та сценарії працюють, але:</w:t>
@@ -256,6 +273,7 @@
           <w:ilvl w:val="1"/>
           <w:numId w:val="1004"/>
         </w:numPr>
+        <w:jc w:val="both"/>
       </w:pPr>
       <w:r>
         <w:t xml:space="preserve">бракує перевірки вхідних даних або повідомлень про помилки;</w:t>
@@ -268,6 +286,7 @@
           <w:ilvl w:val="1"/>
           <w:numId w:val="1004"/>
         </w:numPr>
+        <w:jc w:val="both"/>
       </w:pPr>
       <w:r>
         <w:t xml:space="preserve">трапляються дрібні неточності в ключах команд чи синтаксисі, які не впливають на кінцевий результат;</w:t>
@@ -280,6 +299,7 @@
           <w:ilvl w:val="1"/>
           <w:numId w:val="1004"/>
         </w:numPr>
+        <w:jc w:val="both"/>
       </w:pPr>
       <w:r>
         <w:t xml:space="preserve">коментарі відсутні або формальні;</w:t>
@@ -292,6 +312,7 @@
           <w:ilvl w:val="0"/>
           <w:numId w:val="1003"/>
         </w:numPr>
+        <w:jc w:val="both"/>
       </w:pPr>
       <w:r>
         <w:t xml:space="preserve">тестування проведено частково — лише на коректних даних;</w:t>
@@ -304,6 +325,7 @@
           <w:ilvl w:val="0"/>
           <w:numId w:val="1003"/>
         </w:numPr>
+        <w:jc w:val="both"/>
       </w:pPr>
       <w:r>
         <w:t xml:space="preserve">знімки екрана наведено не для всіх етапів роботи;</w:t>
@@ -316,6 +338,7 @@
           <w:ilvl w:val="0"/>
           <w:numId w:val="1003"/>
         </w:numPr>
+        <w:jc w:val="both"/>
       </w:pPr>
       <w:r>
         <w:t xml:space="preserve">студент пояснює свої дії, але зв’язок із теоретичним матеріалом поверхневий; призначення окремих команд пояснити не може;</w:t>
@@ -328,6 +351,7 @@
           <w:ilvl w:val="0"/>
           <w:numId w:val="1003"/>
         </w:numPr>
+        <w:jc w:val="both"/>
       </w:pPr>
       <w:r>
         <w:t xml:space="preserve">звіт оформлений, але без повної деталізації або без прикладів;</w:t>
@@ -340,6 +364,7 @@
           <w:ilvl w:val="0"/>
           <w:numId w:val="1003"/>
         </w:numPr>
+        <w:jc w:val="both"/>
       </w:pPr>
       <w:r>
         <w:t xml:space="preserve">висновок короткий чи загальний;</w:t>
@@ -352,6 +377,7 @@
           <w:ilvl w:val="0"/>
           <w:numId w:val="1003"/>
         </w:numPr>
+        <w:jc w:val="both"/>
       </w:pPr>
       <w:r>
         <w:t xml:space="preserve">на захисті відповідає на більшість запитань, окремі — лише з навідними запитаннями викладача.</w:t>
@@ -382,6 +408,7 @@
           <w:ilvl w:val="0"/>
           <w:numId w:val="1005"/>
         </w:numPr>
+        <w:jc w:val="both"/>
       </w:pPr>
       <w:r>
         <w:t xml:space="preserve">виконано лише частину пунктів порядку виконання роботи;</w:t>
@@ -394,6 +421,7 @@
           <w:ilvl w:val="0"/>
           <w:numId w:val="1005"/>
         </w:numPr>
+        <w:jc w:val="both"/>
       </w:pPr>
       <w:r>
         <w:t xml:space="preserve">завдання індивідуального варіанта виконано частково або підмінене типовим прикладом з методичних вказівок;</w:t>
@@ -406,6 +434,7 @@
           <w:ilvl w:val="0"/>
           <w:numId w:val="1005"/>
         </w:numPr>
+        <w:jc w:val="both"/>
       </w:pPr>
       <w:r>
         <w:t xml:space="preserve">більшість дій виконано засобами графічного інтерфейсу замість командного рядка;</w:t>
@@ -418,6 +447,7 @@
           <w:ilvl w:val="0"/>
           <w:numId w:val="1005"/>
         </w:numPr>
+        <w:jc w:val="both"/>
       </w:pPr>
       <w:r>
         <w:t xml:space="preserve">команди, командні файли та сценарії:</w:t>
@@ -430,6 +460,7 @@
           <w:ilvl w:val="1"/>
           <w:numId w:val="1006"/>
         </w:numPr>
+        <w:jc w:val="both"/>
       </w:pPr>
       <w:r>
         <w:t xml:space="preserve">працюють з помилками або лише в окремих випадках;</w:t>
@@ -442,6 +473,7 @@
           <w:ilvl w:val="1"/>
           <w:numId w:val="1006"/>
         </w:numPr>
+        <w:jc w:val="both"/>
       </w:pPr>
       <w:r>
         <w:t xml:space="preserve">не містять перевірок і обробки помилок;</w:t>
@@ -454,6 +486,7 @@
           <w:ilvl w:val="1"/>
           <w:numId w:val="1006"/>
         </w:numPr>
+        <w:jc w:val="both"/>
       </w:pPr>
       <w:r>
         <w:t xml:space="preserve">не структуровані, без коментарів;</w:t>
@@ -466,6 +499,7 @@
           <w:ilvl w:val="0"/>
           <w:numId w:val="1005"/>
         </w:numPr>
+        <w:jc w:val="both"/>
       </w:pPr>
       <w:r>
         <w:t xml:space="preserve">тестування не проведено;</w:t>
@@ -478,6 +512,7 @@
           <w:ilvl w:val="0"/>
           <w:numId w:val="1005"/>
         </w:numPr>
+        <w:jc w:val="both"/>
       </w:pPr>
       <w:r>
         <w:t xml:space="preserve">знімки екрана відсутні або не підтверджують заявлений результат;</w:t>
@@ -490,6 +525,7 @@
           <w:ilvl w:val="0"/>
           <w:numId w:val="1005"/>
         </w:numPr>
+        <w:jc w:val="both"/>
       </w:pPr>
       <w:r>
         <w:t xml:space="preserve">студент відтворює команди механічно, пояснити їх дію не може;</w:t>
@@ -502,6 +538,7 @@
           <w:ilvl w:val="0"/>
           <w:numId w:val="1005"/>
         </w:numPr>
+        <w:jc w:val="both"/>
       </w:pPr>
       <w:r>
         <w:t xml:space="preserve">звіт неповний або без належного оформлення;</w:t>
@@ -514,6 +551,7 @@
           <w:ilvl w:val="0"/>
           <w:numId w:val="1005"/>
         </w:numPr>
+        <w:jc w:val="both"/>
       </w:pPr>
       <w:r>
         <w:t xml:space="preserve">висновок формальний або відсутній;</w:t>
@@ -526,6 +564,7 @@
           <w:ilvl w:val="0"/>
           <w:numId w:val="1005"/>
         </w:numPr>
+        <w:jc w:val="both"/>
       </w:pPr>
       <w:r>
         <w:t xml:space="preserve">на захисті відповідає лише на окремі питання.</w:t>
@@ -533,9 +572,10 @@
     </w:p>
     <w:bookmarkEnd w:id="11"/>
     <w:sectPr>
-      <w:footnotePr>
-        <w:numRestart w:val="eachSect"/>
-      </w:footnotePr>
+      <w:pgSz w:h="16838" w:orient="portrait" w:w="11906"/>
+      <w:pgMar w:bottom="1134" w:footer="708" w:gutter="0" w:header="708" w:left="1418" w:right="851" w:top="1134"/>
+      <w:pgNumType w:start="1"/>
+      <w:docGrid w:linePitch="360"/>
     </w:sectPr>
   </w:body>
 </w:document>
@@ -571,74 +611,74 @@
     <w:multiLevelType w:val="multilevel"/>
     <w:lvl w:ilvl="0">
       <w:numFmt w:val="bullet"/>
-      <w:lvlText w:val=" "/>
+      <w:lvlText w:val="–"/>
       <w:lvlJc w:val="left"/>
       <w:pPr>
-        <w:ind w:left="720" w:hanging="360"/>
+        <w:ind w:left="1134" w:hanging="425"/>
       </w:pPr>
     </w:lvl>
     <w:lvl w:ilvl="1">
       <w:numFmt w:val="bullet"/>
-      <w:lvlText w:val=" "/>
+      <w:lvlText w:val="–"/>
       <w:lvlJc w:val="left"/>
       <w:pPr>
-        <w:ind w:left="1440" w:hanging="360"/>
+        <w:ind w:left="1701" w:hanging="425"/>
       </w:pPr>
     </w:lvl>
     <w:lvl w:ilvl="2">
       <w:numFmt w:val="bullet"/>
-      <w:lvlText w:val=" "/>
+      <w:lvlText w:val="–"/>
       <w:lvlJc w:val="left"/>
       <w:pPr>
-        <w:ind w:left="2160" w:hanging="360"/>
+        <w:ind w:left="2268" w:hanging="425"/>
       </w:pPr>
     </w:lvl>
     <w:lvl w:ilvl="3">
       <w:numFmt w:val="bullet"/>
-      <w:lvlText w:val=" "/>
+      <w:lvlText w:val="–"/>
       <w:lvlJc w:val="left"/>
       <w:pPr>
-        <w:ind w:left="2880" w:hanging="360"/>
+        <w:ind w:left="2835" w:hanging="425"/>
       </w:pPr>
     </w:lvl>
     <w:lvl w:ilvl="4">
       <w:numFmt w:val="bullet"/>
-      <w:lvlText w:val=" "/>
+      <w:lvlText w:val="–"/>
       <w:lvlJc w:val="left"/>
       <w:pPr>
-        <w:ind w:left="3600" w:hanging="360"/>
+        <w:ind w:left="3402" w:hanging="425"/>
       </w:pPr>
     </w:lvl>
     <w:lvl w:ilvl="5">
       <w:numFmt w:val="bullet"/>
-      <w:lvlText w:val=" "/>
+      <w:lvlText w:val="–"/>
       <w:lvlJc w:val="left"/>
       <w:pPr>
-        <w:ind w:left="4320" w:hanging="360"/>
+        <w:ind w:left="3969" w:hanging="425"/>
       </w:pPr>
     </w:lvl>
     <w:lvl w:ilvl="6">
       <w:numFmt w:val="bullet"/>
-      <w:lvlText w:val=" "/>
+      <w:lvlText w:val="–"/>
       <w:lvlJc w:val="left"/>
       <w:pPr>
-        <w:ind w:left="5040" w:hanging="360"/>
+        <w:ind w:left="4536" w:hanging="425"/>
       </w:pPr>
     </w:lvl>
     <w:lvl w:ilvl="7">
       <w:numFmt w:val="bullet"/>
-      <w:lvlText w:val=" "/>
+      <w:lvlText w:val="–"/>
       <w:lvlJc w:val="left"/>
       <w:pPr>
-        <w:ind w:left="5760" w:hanging="360"/>
+        <w:ind w:left="5103" w:hanging="425"/>
       </w:pPr>
     </w:lvl>
     <w:lvl w:ilvl="8">
       <w:numFmt w:val="bullet"/>
-      <w:lvlText w:val=" "/>
+      <w:lvlText w:val="–"/>
       <w:lvlJc w:val="left"/>
       <w:pPr>
-        <w:ind w:left="6480" w:hanging="360"/>
+        <w:ind w:left="5670" w:hanging="425"/>
       </w:pPr>
     </w:lvl>
   </w:abstractNum>
@@ -647,21 +687,19 @@
     <w:multiLevelType w:val="multilevel"/>
     <w:lvl w:ilvl="0">
       <w:numFmt w:val="bullet"/>
-      <w:lvlText w:val=""/>
+      <w:lvlText w:val="–"/>
       <w:lvlJc w:val="left"/>
       <w:pPr>
-        <w:ind w:left="720" w:hanging="360"/>
-      </w:pPr>
-      <w:rPr>
-        <w:rFonts w:ascii="Symbol" w:hAnsi="Symbol" w:cs="Symbol" w:hint="default"/>
-      </w:rPr>
+        <w:ind w:left="1134" w:hanging="425"/>
+      </w:pPr>
+      <w:rPr/>
     </w:lvl>
     <w:lvl w:ilvl="1">
       <w:numFmt w:val="bullet"/>
-      <w:lvlText w:val="o"/>
+      <w:lvlText w:val="–"/>
       <w:lvlJc w:val="left"/>
       <w:pPr>
-        <w:ind w:left="1440" w:hanging="360"/>
+        <w:ind w:left="1701" w:hanging="425"/>
       </w:pPr>
       <w:rPr>
         <w:rFonts w:ascii="Courier New" w:hAnsi="Courier New" w:cs="Courier New" w:hint="default"/>
@@ -669,32 +707,28 @@
     </w:lvl>
     <w:lvl w:ilvl="2">
       <w:numFmt w:val="bullet"/>
-      <w:lvlText w:val=""/>
+      <w:lvlText w:val="–"/>
       <w:lvlJc w:val="left"/>
       <w:pPr>
-        <w:ind w:left="2160" w:hanging="360"/>
-      </w:pPr>
-      <w:rPr>
-        <w:rFonts w:ascii="Wingdings" w:hAnsi="Wingdings" w:cs="Wingdings" w:hint="default"/>
-      </w:rPr>
+        <w:ind w:left="2268" w:hanging="425"/>
+      </w:pPr>
+      <w:rPr/>
     </w:lvl>
     <w:lvl w:ilvl="3">
       <w:numFmt w:val="bullet"/>
-      <w:lvlText w:val=""/>
+      <w:lvlText w:val="–"/>
       <w:lvlJc w:val="left"/>
       <w:pPr>
-        <w:ind w:left="2880" w:hanging="360"/>
-      </w:pPr>
-      <w:rPr>
-        <w:rFonts w:ascii="Symbol" w:hAnsi="Symbol" w:cs="Symbol" w:hint="default"/>
-      </w:rPr>
+        <w:ind w:left="2835" w:hanging="425"/>
+      </w:pPr>
+      <w:rPr/>
     </w:lvl>
     <w:lvl w:ilvl="4">
       <w:numFmt w:val="bullet"/>
-      <w:lvlText w:val="o"/>
+      <w:lvlText w:val="–"/>
       <w:lvlJc w:val="left"/>
       <w:pPr>
-        <w:ind w:left="3600" w:hanging="360"/>
+        <w:ind w:left="3402" w:hanging="425"/>
       </w:pPr>
       <w:rPr>
         <w:rFonts w:ascii="Courier New" w:hAnsi="Courier New" w:cs="Courier New" w:hint="default"/>
@@ -702,32 +736,28 @@
     </w:lvl>
     <w:lvl w:ilvl="5">
       <w:numFmt w:val="bullet"/>
-      <w:lvlText w:val=""/>
+      <w:lvlText w:val="–"/>
       <w:lvlJc w:val="left"/>
       <w:pPr>
-        <w:ind w:left="4320" w:hanging="360"/>
-      </w:pPr>
-      <w:rPr>
-        <w:rFonts w:ascii="Wingdings" w:hAnsi="Wingdings" w:cs="Wingdings" w:hint="default"/>
-      </w:rPr>
+        <w:ind w:left="3969" w:hanging="425"/>
+      </w:pPr>
+      <w:rPr/>
     </w:lvl>
     <w:lvl w:ilvl="6">
       <w:numFmt w:val="bullet"/>
-      <w:lvlText w:val=""/>
+      <w:lvlText w:val="–"/>
       <w:lvlJc w:val="left"/>
       <w:pPr>
-        <w:ind w:left="5040" w:hanging="360"/>
-      </w:pPr>
-      <w:rPr>
-        <w:rFonts w:ascii="Symbol" w:hAnsi="Symbol" w:cs="Symbol" w:hint="default"/>
-      </w:rPr>
+        <w:ind w:left="4536" w:hanging="425"/>
+      </w:pPr>
+      <w:rPr/>
     </w:lvl>
     <w:lvl w:ilvl="7">
       <w:numFmt w:val="bullet"/>
-      <w:lvlText w:val="o"/>
+      <w:lvlText w:val="–"/>
       <w:lvlJc w:val="left"/>
       <w:pPr>
-        <w:ind w:left="5760" w:hanging="360"/>
+        <w:ind w:left="5103" w:hanging="425"/>
       </w:pPr>
       <w:rPr>
         <w:rFonts w:ascii="Courier New" w:hAnsi="Courier New" w:cs="Courier New" w:hint="default"/>
@@ -735,14 +765,12 @@
     </w:lvl>
     <w:lvl w:ilvl="8">
       <w:numFmt w:val="bullet"/>
-      <w:lvlText w:val=""/>
+      <w:lvlText w:val="–"/>
       <w:lvlJc w:val="left"/>
       <w:pPr>
-        <w:ind w:left="6480" w:hanging="360"/>
-      </w:pPr>
-      <w:rPr>
-        <w:rFonts w:ascii="Wingdings" w:hAnsi="Wingdings" w:cs="Wingdings" w:hint="default"/>
-      </w:rPr>
+        <w:ind w:left="5670" w:hanging="425"/>
+      </w:pPr>
+      <w:rPr/>
     </w:lvl>
   </w:abstractNum>
   <w:num w:numId="1000">
@@ -774,15 +802,15 @@
   <w:docDefaults>
     <w:rPrDefault>
       <w:rPr>
-        <w:rFonts w:asciiTheme="minorHAnsi" w:cstheme="minorBidi" w:eastAsiaTheme="minorEastAsia" w:hAnsiTheme="minorHAnsi"/>
-        <w:sz w:val="24"/>
-        <w:szCs w:val="24"/>
-        <w:lang w:bidi="ar-SA" w:eastAsia="zh-CN" w:val="en-US"/>
+        <w:rFonts w:ascii="Times New Roman" w:cs="Times New Roman" w:eastAsia="Times New Roman" w:hAnsi="Times New Roman"/>
+        <w:sz w:val="28"/>
+        <w:szCs w:val="28"/>
+        <w:lang w:val="uk-UA"/>
       </w:rPr>
     </w:rPrDefault>
     <w:pPrDefault>
       <w:pPr>
-        <w:spacing w:after="200"/>
+        <w:spacing w:after="0" w:before="0" w:line="312" w:lineRule="auto"/>
       </w:pPr>
     </w:pPrDefault>
   </w:docDefaults>
@@ -790,14 +818,19 @@
   <w:style w:default="1" w:styleId="Normal" w:type="paragraph">
     <w:name w:val="Normal"/>
     <w:qFormat/>
+    <w:pPr>
+      <w:spacing w:after="0" w:before="0" w:line="312" w:lineRule="auto"/>
+      <w:jc w:val="left"/>
+    </w:pPr>
   </w:style>
   <w:style w:styleId="BodyText" w:type="paragraph">
     <w:name w:val="Body Text"/>
     <w:basedOn w:val="Normal"/>
-    <w:link w:val="BodyTextChar"/>
-    <w:qFormat/>
-    <w:pPr>
-      <w:spacing w:after="180" w:before="180"/>
+    <w:qFormat/>
+    <w:pPr>
+      <w:spacing w:after="0" w:before="0" w:line="312" w:lineRule="auto"/>
+      <w:ind w:firstLine="709"/>
+      <w:jc w:val="both"/>
     </w:pPr>
   </w:style>
   <w:style w:customStyle="1" w:styleId="FirstParagraph" w:type="paragraph">
@@ -808,29 +841,28 @@
   </w:style>
   <w:style w:customStyle="1" w:styleId="Compact" w:type="paragraph">
     <w:name w:val="Compact"/>
-    <w:basedOn w:val="BodyText"/>
-    <w:qFormat/>
-    <w:pPr>
-      <w:spacing w:after="36" w:before="36"/>
+    <w:basedOn w:val="Normal"/>
+    <w:qFormat/>
+    <w:pPr>
+      <w:spacing w:after="0" w:before="0" w:line="312" w:lineRule="auto"/>
+      <w:ind w:firstLine="0"/>
+      <w:contextualSpacing/>
     </w:pPr>
   </w:style>
   <w:style w:styleId="Title" w:type="paragraph">
     <w:name w:val="Title"/>
     <w:basedOn w:val="Normal"/>
-    <w:next w:val="BodyText"/>
-    <w:link w:val="TitleChar"/>
-    <w:uiPriority w:val="10"/>
-    <w:qFormat/>
-    <w:rsid w:val="00A10FD9"/>
-    <w:pPr>
-      <w:spacing w:after="80" w:line="240" w:lineRule="auto"/>
-      <w:contextualSpacing/>
+    <w:next w:val="Subtitle"/>
+    <w:qFormat/>
+    <w:pPr>
+      <w:spacing w:after="120" w:before="0" w:line="312" w:lineRule="auto"/>
+      <w:ind w:firstLine="0"/>
       <w:jc w:val="center"/>
     </w:pPr>
     <w:rPr>
-      <w:rFonts w:asciiTheme="majorHAnsi" w:cstheme="majorBidi" w:eastAsiaTheme="majorEastAsia" w:hAnsiTheme="majorHAnsi"/>
-      <w:sz w:val="56"/>
-      <w:szCs w:val="56"/>
+      <w:rFonts w:ascii="Times New Roman" w:cs="Times New Roman" w:eastAsia="Times New Roman" w:hAnsi="Times New Roman"/>
+      <w:sz w:val="28"/>
+      <w:szCs w:val="28"/>
     </w:rPr>
   </w:style>
   <w:style w:customStyle="1" w:styleId="TitleChar" w:type="character">
@@ -847,20 +879,19 @@
   </w:style>
   <w:style w:styleId="Subtitle" w:type="paragraph">
     <w:name w:val="Subtitle"/>
-    <w:basedOn w:val="Title"/>
-    <w:next w:val="BodyText"/>
-    <w:link w:val="SubtitleChar"/>
-    <w:uiPriority w:val="11"/>
-    <w:qFormat/>
-    <w:rsid w:val="00A10FD9"/>
-    <w:pPr>
-      <w:numPr>
-        <w:ilvl w:val="1"/>
-      </w:numPr>
-    </w:pPr>
-    <w:rPr>
-      <w:rFonts w:cstheme="majorBidi" w:eastAsiaTheme="majorEastAsia"/>
-      <w:spacing w:val="15"/>
+    <w:basedOn w:val="Normal"/>
+    <w:next w:val="FirstParagraph"/>
+    <w:qFormat/>
+    <w:pPr>
+      <w:spacing w:after="240" w:before="0" w:line="312" w:lineRule="auto"/>
+      <w:ind w:firstLine="0"/>
+      <w:jc w:val="center"/>
+    </w:pPr>
+    <w:rPr>
+      <w:rFonts w:ascii="Times New Roman" w:cs="Times New Roman" w:eastAsia="Times New Roman" w:hAnsi="Times New Roman"/>
+      <w:b/>
+      <w:bCs/>
+      <w:caps/>
       <w:sz w:val="28"/>
       <w:szCs w:val="28"/>
     </w:rPr>
@@ -950,66 +981,56 @@
   <w:style w:styleId="Heading1" w:type="paragraph">
     <w:name w:val="heading 1"/>
     <w:basedOn w:val="Normal"/>
-    <w:next w:val="BodyText"/>
-    <w:link w:val="Heading1Char"/>
-    <w:uiPriority w:val="9"/>
-    <w:qFormat/>
-    <w:rsid w:val="00A10FD9"/>
+    <w:next w:val="FirstParagraph"/>
+    <w:qFormat/>
     <w:pPr>
       <w:keepNext/>
-      <w:keepLines/>
-      <w:spacing w:after="80" w:before="360"/>
-      <w:outlineLvl w:val="0"/>
-    </w:pPr>
-    <w:rPr>
-      <w:rFonts w:asciiTheme="majorHAnsi" w:cstheme="majorBidi" w:eastAsiaTheme="majorEastAsia" w:hAnsiTheme="majorHAnsi"/>
-      <w:color w:themeColor="accent1" w:themeShade="BF" w:val="0F4761"/>
-      <w:sz w:val="40"/>
-      <w:szCs w:val="40"/>
+      <w:spacing w:after="120" w:before="240" w:line="312" w:lineRule="auto"/>
+      <w:ind w:firstLine="0"/>
+      <w:jc w:val="center"/>
+    </w:pPr>
+    <w:rPr>
+      <w:rFonts w:ascii="Times New Roman" w:cs="Times New Roman" w:eastAsia="Times New Roman" w:hAnsi="Times New Roman"/>
+      <w:b/>
+      <w:bCs/>
+      <w:sz w:val="28"/>
+      <w:szCs w:val="28"/>
     </w:rPr>
   </w:style>
   <w:style w:styleId="Heading2" w:type="paragraph">
     <w:name w:val="heading 2"/>
     <w:basedOn w:val="Normal"/>
-    <w:next w:val="BodyText"/>
-    <w:link w:val="Heading2Char"/>
-    <w:uiPriority w:val="9"/>
-    <w:semiHidden/>
-    <w:unhideWhenUsed/>
-    <w:qFormat/>
-    <w:rsid w:val="00A10FD9"/>
+    <w:next w:val="FirstParagraph"/>
+    <w:qFormat/>
     <w:pPr>
       <w:keepNext/>
-      <w:keepLines/>
-      <w:spacing w:after="80" w:before="160"/>
-      <w:outlineLvl w:val="1"/>
-    </w:pPr>
-    <w:rPr>
-      <w:rFonts w:asciiTheme="majorHAnsi" w:cstheme="majorBidi" w:eastAsiaTheme="majorEastAsia" w:hAnsiTheme="majorHAnsi"/>
-      <w:color w:themeColor="accent1" w:themeShade="BF" w:val="0F4761"/>
-      <w:sz w:val="32"/>
-      <w:szCs w:val="32"/>
+      <w:spacing w:after="120" w:before="240" w:line="312" w:lineRule="auto"/>
+      <w:ind w:firstLine="0"/>
+      <w:jc w:val="center"/>
+    </w:pPr>
+    <w:rPr>
+      <w:rFonts w:ascii="Times New Roman" w:cs="Times New Roman" w:eastAsia="Times New Roman" w:hAnsi="Times New Roman"/>
+      <w:b/>
+      <w:bCs/>
+      <w:sz w:val="28"/>
+      <w:szCs w:val="28"/>
     </w:rPr>
   </w:style>
   <w:style w:styleId="Heading3" w:type="paragraph">
     <w:name w:val="heading 3"/>
     <w:basedOn w:val="Normal"/>
-    <w:next w:val="BodyText"/>
-    <w:link w:val="Heading3Char"/>
-    <w:uiPriority w:val="9"/>
-    <w:semiHidden/>
-    <w:unhideWhenUsed/>
-    <w:qFormat/>
-    <w:rsid w:val="00A10FD9"/>
+    <w:next w:val="FirstParagraph"/>
+    <w:qFormat/>
     <w:pPr>
       <w:keepNext/>
-      <w:keepLines/>
-      <w:spacing w:after="80" w:before="160"/>
-      <w:outlineLvl w:val="2"/>
-    </w:pPr>
-    <w:rPr>
-      <w:rFonts w:cstheme="majorBidi" w:eastAsiaTheme="majorEastAsia"/>
-      <w:color w:themeColor="accent1" w:themeShade="BF" w:val="0F4761"/>
+      <w:spacing w:after="0" w:before="140" w:line="312" w:lineRule="auto"/>
+      <w:ind w:firstLine="709"/>
+      <w:jc w:val="left"/>
+    </w:pPr>
+    <w:rPr>
+      <w:rFonts w:ascii="Times New Roman" w:cs="Times New Roman" w:eastAsia="Times New Roman" w:hAnsi="Times New Roman"/>
+      <w:b/>
+      <w:bCs/>
       <w:sz w:val="28"/>
       <w:szCs w:val="28"/>
     </w:rPr>
@@ -1017,68 +1038,58 @@
   <w:style w:styleId="Heading4" w:type="paragraph">
     <w:name w:val="heading 4"/>
     <w:basedOn w:val="Normal"/>
-    <w:next w:val="BodyText"/>
-    <w:link w:val="Heading4Char"/>
-    <w:uiPriority w:val="9"/>
-    <w:semiHidden/>
-    <w:unhideWhenUsed/>
-    <w:qFormat/>
-    <w:rsid w:val="00A10FD9"/>
+    <w:next w:val="FirstParagraph"/>
+    <w:qFormat/>
     <w:pPr>
       <w:keepNext/>
-      <w:keepLines/>
-      <w:spacing w:after="40" w:before="80"/>
-      <w:outlineLvl w:val="3"/>
-    </w:pPr>
-    <w:rPr>
-      <w:rFonts w:cstheme="majorBidi" w:eastAsiaTheme="majorEastAsia"/>
-      <w:i/>
-      <w:iCs/>
-      <w:color w:themeColor="accent1" w:themeShade="BF" w:val="0F4761"/>
+      <w:spacing w:after="0" w:before="120" w:line="312" w:lineRule="auto"/>
+      <w:ind w:firstLine="709"/>
+      <w:jc w:val="left"/>
+    </w:pPr>
+    <w:rPr>
+      <w:rFonts w:ascii="Times New Roman" w:cs="Times New Roman" w:eastAsia="Times New Roman" w:hAnsi="Times New Roman"/>
+      <w:b/>
+      <w:bCs/>
+      <w:sz w:val="28"/>
+      <w:szCs w:val="28"/>
     </w:rPr>
   </w:style>
   <w:style w:styleId="Heading5" w:type="paragraph">
     <w:name w:val="heading 5"/>
     <w:basedOn w:val="Normal"/>
-    <w:next w:val="BodyText"/>
-    <w:link w:val="Heading5Char"/>
-    <w:uiPriority w:val="9"/>
-    <w:semiHidden/>
-    <w:unhideWhenUsed/>
-    <w:qFormat/>
-    <w:rsid w:val="00A10FD9"/>
+    <w:next w:val="FirstParagraph"/>
+    <w:qFormat/>
     <w:pPr>
       <w:keepNext/>
-      <w:keepLines/>
-      <w:spacing w:after="40" w:before="80"/>
-      <w:outlineLvl w:val="4"/>
-    </w:pPr>
-    <w:rPr>
-      <w:rFonts w:cstheme="majorBidi" w:eastAsiaTheme="majorEastAsia"/>
-      <w:color w:themeColor="accent1" w:themeShade="BF" w:val="0F4761"/>
+      <w:spacing w:after="0" w:before="120" w:line="312" w:lineRule="auto"/>
+      <w:ind w:firstLine="709"/>
+      <w:jc w:val="left"/>
+    </w:pPr>
+    <w:rPr>
+      <w:rFonts w:ascii="Times New Roman" w:cs="Times New Roman" w:eastAsia="Times New Roman" w:hAnsi="Times New Roman"/>
+      <w:b/>
+      <w:bCs/>
+      <w:sz w:val="28"/>
+      <w:szCs w:val="28"/>
     </w:rPr>
   </w:style>
   <w:style w:styleId="Heading6" w:type="paragraph">
     <w:name w:val="heading 6"/>
     <w:basedOn w:val="Normal"/>
-    <w:next w:val="BodyText"/>
-    <w:link w:val="Heading6Char"/>
-    <w:uiPriority w:val="9"/>
-    <w:semiHidden/>
-    <w:unhideWhenUsed/>
-    <w:qFormat/>
-    <w:rsid w:val="00A10FD9"/>
+    <w:next w:val="FirstParagraph"/>
+    <w:qFormat/>
     <w:pPr>
       <w:keepNext/>
-      <w:keepLines/>
-      <w:spacing w:after="0" w:before="40"/>
-      <w:outlineLvl w:val="5"/>
-    </w:pPr>
-    <w:rPr>
-      <w:rFonts w:cstheme="majorBidi" w:eastAsiaTheme="majorEastAsia"/>
-      <w:i/>
-      <w:iCs/>
-      <w:color w:themeColor="text1" w:themeTint="A6" w:val="595959"/>
+      <w:spacing w:after="0" w:before="120" w:line="312" w:lineRule="auto"/>
+      <w:ind w:firstLine="709"/>
+      <w:jc w:val="left"/>
+    </w:pPr>
+    <w:rPr>
+      <w:rFonts w:ascii="Times New Roman" w:cs="Times New Roman" w:eastAsia="Times New Roman" w:hAnsi="Times New Roman"/>
+      <w:b/>
+      <w:bCs/>
+      <w:sz w:val="28"/>
+      <w:szCs w:val="28"/>
     </w:rPr>
   </w:style>
   <w:style w:styleId="Heading7" w:type="paragraph">
@@ -1268,13 +1279,10 @@
   <w:style w:styleId="BlockText" w:type="paragraph">
     <w:name w:val="Block Text"/>
     <w:basedOn w:val="BodyText"/>
-    <w:next w:val="BodyText"/>
-    <w:uiPriority w:val="9"/>
-    <w:unhideWhenUsed/>
-    <w:qFormat/>
-    <w:pPr>
-      <w:spacing w:after="100" w:before="100"/>
-      <w:ind w:firstLine="0" w:left="480" w:right="480"/>
+    <w:qFormat/>
+    <w:pPr>
+      <w:spacing w:after="0" w:before="0" w:line="312" w:lineRule="auto"/>
+      <w:ind w:firstLine="0" w:left="1134"/>
     </w:pPr>
   </w:style>
   <w:style w:styleId="FootnoteText" w:type="paragraph">
@@ -1305,24 +1313,44 @@
   <w:style w:default="1" w:styleId="Table" w:type="table">
     <w:name w:val="Table"/>
     <w:basedOn w:val="TableNormal"/>
-    <w:semiHidden/>
-    <w:unhideWhenUsed/>
-    <w:qFormat/>
+    <w:qFormat/>
+    <w:pPr>
+      <w:spacing w:after="0" w:before="0" w:line="240" w:lineRule="auto"/>
+      <w:ind w:firstLine="0"/>
+      <w:jc w:val="left"/>
+    </w:pPr>
+    <w:rPr>
+      <w:rFonts w:ascii="Times New Roman" w:cs="Times New Roman" w:eastAsia="Times New Roman" w:hAnsi="Times New Roman"/>
+      <w:sz w:val="24"/>
+      <w:szCs w:val="24"/>
+    </w:rPr>
     <w:tblPr>
       <w:tblInd w:type="dxa" w:w="0"/>
+      <w:tblBorders>
+        <w:top w:color="000000" w:space="0" w:sz="4" w:val="single"/>
+        <w:left w:color="000000" w:space="0" w:sz="4" w:val="single"/>
+        <w:bottom w:color="000000" w:space="0" w:sz="4" w:val="single"/>
+        <w:right w:color="000000" w:space="0" w:sz="4" w:val="single"/>
+        <w:insideH w:color="000000" w:space="0" w:sz="4" w:val="single"/>
+        <w:insideV w:color="000000" w:space="0" w:sz="4" w:val="single"/>
+      </w:tblBorders>
       <w:tblCellMar>
-        <w:top w:type="dxa" w:w="0"/>
-        <w:left w:type="dxa" w:w="108"/>
-        <w:bottom w:type="dxa" w:w="0"/>
-        <w:right w:type="dxa" w:w="108"/>
+        <w:top w:type="dxa" w:w="40"/>
+        <w:left w:type="dxa" w:w="70"/>
+        <w:bottom w:type="dxa" w:w="40"/>
+        <w:right w:type="dxa" w:w="70"/>
       </w:tblCellMar>
     </w:tblPr>
     <w:tblStylePr w:type="firstRow">
+      <w:pPr>
+        <w:jc w:val="center"/>
+      </w:pPr>
+      <w:rPr>
+        <w:b/>
+        <w:bCs/>
+      </w:rPr>
       <w:tcPr>
-        <w:tcBorders>
-          <w:bottom w:val="single"/>
-        </w:tcBorders>
-        <w:vAlign w:val="bottom"/>
+        <w:vAlign w:val="center"/>
       </w:tcPr>
     </w:tblStylePr>
   </w:style>
@@ -1356,18 +1384,48 @@
   </w:style>
   <w:style w:customStyle="1" w:styleId="TableCaption" w:type="paragraph">
     <w:name w:val="Table Caption"/>
-    <w:basedOn w:val="Caption"/>
+    <w:basedOn w:val="Normal"/>
+    <w:next w:val="FirstParagraph"/>
+    <w:qFormat/>
     <w:pPr>
       <w:keepNext/>
-    </w:pPr>
+      <w:spacing w:after="60" w:before="160" w:line="312" w:lineRule="auto"/>
+      <w:ind w:firstLine="0"/>
+      <w:jc w:val="center"/>
+    </w:pPr>
+    <w:rPr>
+      <w:rFonts w:ascii="Times New Roman" w:cs="Times New Roman" w:eastAsia="Times New Roman" w:hAnsi="Times New Roman"/>
+      <w:sz w:val="28"/>
+      <w:szCs w:val="28"/>
+    </w:rPr>
   </w:style>
   <w:style w:customStyle="1" w:styleId="ImageCaption" w:type="paragraph">
     <w:name w:val="Image Caption"/>
-    <w:basedOn w:val="Caption"/>
+    <w:basedOn w:val="Normal"/>
+    <w:next w:val="FirstParagraph"/>
+    <w:qFormat/>
+    <w:pPr>
+      <w:spacing w:after="160" w:before="60" w:line="312" w:lineRule="auto"/>
+      <w:ind w:firstLine="0"/>
+      <w:jc w:val="center"/>
+    </w:pPr>
+    <w:rPr>
+      <w:rFonts w:ascii="Times New Roman" w:cs="Times New Roman" w:eastAsia="Times New Roman" w:hAnsi="Times New Roman"/>
+      <w:sz w:val="28"/>
+      <w:szCs w:val="28"/>
+    </w:rPr>
   </w:style>
   <w:style w:customStyle="1" w:styleId="Figure" w:type="paragraph">
     <w:name w:val="Figure"/>
     <w:basedOn w:val="Normal"/>
+    <w:next w:val="ImageCaption"/>
+    <w:qFormat/>
+    <w:pPr>
+      <w:keepNext/>
+      <w:spacing w:after="60" w:before="160" w:line="312" w:lineRule="auto"/>
+      <w:ind w:firstLine="0"/>
+      <w:jc w:val="center"/>
+    </w:pPr>
   </w:style>
   <w:style w:customStyle="1" w:styleId="CaptionedFigure" w:type="paragraph">
     <w:name w:val="Captioned Figure"/>
@@ -1383,10 +1441,9 @@
   </w:style>
   <w:style w:customStyle="1" w:styleId="VerbatimChar" w:type="character">
     <w:name w:val="Verbatim Char"/>
-    <w:basedOn w:val="BodyTextChar"/>
-    <w:rPr>
-      <w:rFonts w:ascii="Consolas" w:hAnsi="Consolas"/>
-      <w:sz w:val="22"/>
+    <w:basedOn w:val="DefaultParagraphFont"/>
+    <w:rPr>
+      <w:rFonts w:ascii="Times New Roman" w:cs="Times New Roman" w:eastAsia="Times New Roman" w:hAnsi="Times New Roman"/>
     </w:rPr>
   </w:style>
   <w:style w:customStyle="1" w:styleId="SectionNumber" w:type="character">
@@ -1425,239 +1482,27 @@
       <w:color w:themeColor="accent1" w:themeShade="BF" w:val="365F91"/>
     </w:rPr>
   </w:style>
-  <w:style w:type="paragraph" w:customStyle="1" w:styleId="SourceCode">
+  <w:style w:customStyle="1" w:styleId="SourceCode" w:type="paragraph">
     <w:name w:val="Source Code"/>
     <w:basedOn w:val="Normal"/>
-    <w:link w:val="VerbatimChar"/>
-    <w:pPr>
-      <w:wordWrap w:val="off"/>
-    </w:pPr>
-  </w:style>
-  <w:style w:type="character" w:customStyle="1" w:styleId="KeywordTok">
-    <w:name w:val="KeywordTok"/>
-    <w:basedOn w:val="VerbatimChar"/>
-    <w:rPr>
-      <w:b/>
-      <w:color w:val="007020"/>
-    </w:rPr>
-  </w:style>
-  <w:style w:type="character" w:customStyle="1" w:styleId="DataTypeTok">
-    <w:name w:val="DataTypeTok"/>
-    <w:basedOn w:val="VerbatimChar"/>
-    <w:rPr>
-      <w:color w:val="902000"/>
-    </w:rPr>
-  </w:style>
-  <w:style w:type="character" w:customStyle="1" w:styleId="DecValTok">
-    <w:name w:val="DecValTok"/>
-    <w:basedOn w:val="VerbatimChar"/>
-    <w:rPr>
-      <w:color w:val="40a070"/>
-    </w:rPr>
-  </w:style>
-  <w:style w:type="character" w:customStyle="1" w:styleId="BaseNTok">
-    <w:name w:val="BaseNTok"/>
-    <w:basedOn w:val="VerbatimChar"/>
-    <w:rPr>
-      <w:color w:val="40a070"/>
-    </w:rPr>
-  </w:style>
-  <w:style w:type="character" w:customStyle="1" w:styleId="FloatTok">
-    <w:name w:val="FloatTok"/>
-    <w:basedOn w:val="VerbatimChar"/>
-    <w:rPr>
-      <w:color w:val="40a070"/>
-    </w:rPr>
-  </w:style>
-  <w:style w:type="character" w:customStyle="1" w:styleId="ConstantTok">
-    <w:name w:val="ConstantTok"/>
-    <w:basedOn w:val="VerbatimChar"/>
-    <w:rPr>
-      <w:color w:val="880000"/>
-    </w:rPr>
-  </w:style>
-  <w:style w:type="character" w:customStyle="1" w:styleId="CharTok">
-    <w:name w:val="CharTok"/>
-    <w:basedOn w:val="VerbatimChar"/>
-    <w:rPr>
-      <w:color w:val="4070a0"/>
-    </w:rPr>
-  </w:style>
-  <w:style w:type="character" w:customStyle="1" w:styleId="SpecialCharTok">
-    <w:name w:val="SpecialCharTok"/>
-    <w:basedOn w:val="VerbatimChar"/>
-    <w:rPr>
-      <w:color w:val="4070a0"/>
-    </w:rPr>
-  </w:style>
-  <w:style w:type="character" w:customStyle="1" w:styleId="StringTok">
-    <w:name w:val="StringTok"/>
-    <w:basedOn w:val="VerbatimChar"/>
-    <w:rPr>
-      <w:color w:val="4070a0"/>
-    </w:rPr>
-  </w:style>
-  <w:style w:type="character" w:customStyle="1" w:styleId="VerbatimStringTok">
-    <w:name w:val="VerbatimStringTok"/>
-    <w:basedOn w:val="VerbatimChar"/>
-    <w:rPr>
-      <w:color w:val="4070a0"/>
-    </w:rPr>
-  </w:style>
-  <w:style w:type="character" w:customStyle="1" w:styleId="SpecialStringTok">
-    <w:name w:val="SpecialStringTok"/>
-    <w:basedOn w:val="VerbatimChar"/>
-    <w:rPr>
-      <w:color w:val="bb6688"/>
-    </w:rPr>
-  </w:style>
-  <w:style w:type="character" w:customStyle="1" w:styleId="ImportTok">
-    <w:name w:val="ImportTok"/>
-    <w:basedOn w:val="VerbatimChar"/>
-    <w:rPr>
-      <w:b/>
-      <w:color w:val="008000"/>
-    </w:rPr>
-  </w:style>
-  <w:style w:type="character" w:customStyle="1" w:styleId="CommentTok">
-    <w:name w:val="CommentTok"/>
-    <w:basedOn w:val="VerbatimChar"/>
-    <w:rPr>
-      <w:i/>
-      <w:color w:val="60a0b0"/>
-    </w:rPr>
-  </w:style>
-  <w:style w:type="character" w:customStyle="1" w:styleId="DocumentationTok">
-    <w:name w:val="DocumentationTok"/>
-    <w:basedOn w:val="VerbatimChar"/>
-    <w:rPr>
-      <w:i/>
-      <w:color w:val="ba2121"/>
-    </w:rPr>
-  </w:style>
-  <w:style w:type="character" w:customStyle="1" w:styleId="AnnotationTok">
-    <w:name w:val="AnnotationTok"/>
-    <w:basedOn w:val="VerbatimChar"/>
-    <w:rPr>
-      <w:b/>
-      <w:i/>
-      <w:color w:val="60a0b0"/>
-    </w:rPr>
-  </w:style>
-  <w:style w:type="character" w:customStyle="1" w:styleId="CommentVarTok">
-    <w:name w:val="CommentVarTok"/>
-    <w:basedOn w:val="VerbatimChar"/>
-    <w:rPr>
-      <w:b/>
-      <w:i/>
-      <w:color w:val="60a0b0"/>
-    </w:rPr>
-  </w:style>
-  <w:style w:type="character" w:customStyle="1" w:styleId="OtherTok">
-    <w:name w:val="OtherTok"/>
-    <w:basedOn w:val="VerbatimChar"/>
-    <w:rPr>
-      <w:color w:val="007020"/>
-    </w:rPr>
-  </w:style>
-  <w:style w:type="character" w:customStyle="1" w:styleId="FunctionTok">
-    <w:name w:val="FunctionTok"/>
-    <w:basedOn w:val="VerbatimChar"/>
-    <w:rPr>
-      <w:color w:val="06287e"/>
-    </w:rPr>
-  </w:style>
-  <w:style w:type="character" w:customStyle="1" w:styleId="VariableTok">
-    <w:name w:val="VariableTok"/>
-    <w:basedOn w:val="VerbatimChar"/>
-    <w:rPr>
-      <w:color w:val="19177c"/>
-    </w:rPr>
-  </w:style>
-  <w:style w:type="character" w:customStyle="1" w:styleId="ControlFlowTok">
-    <w:name w:val="ControlFlowTok"/>
-    <w:basedOn w:val="VerbatimChar"/>
-    <w:rPr>
-      <w:b/>
-      <w:color w:val="007020"/>
-    </w:rPr>
-  </w:style>
-  <w:style w:type="character" w:customStyle="1" w:styleId="OperatorTok">
-    <w:name w:val="OperatorTok"/>
-    <w:basedOn w:val="VerbatimChar"/>
-    <w:rPr>
-      <w:color w:val="666666"/>
-    </w:rPr>
-  </w:style>
-  <w:style w:type="character" w:customStyle="1" w:styleId="BuiltInTok">
-    <w:name w:val="BuiltInTok"/>
-    <w:basedOn w:val="VerbatimChar"/>
-    <w:rPr>
-      <w:color w:val="008000"/>
-    </w:rPr>
-  </w:style>
-  <w:style w:type="character" w:customStyle="1" w:styleId="ExtensionTok">
-    <w:name w:val="ExtensionTok"/>
-    <w:basedOn w:val="VerbatimChar"/>
-    <w:rPr/>
-  </w:style>
-  <w:style w:type="character" w:customStyle="1" w:styleId="PreprocessorTok">
-    <w:name w:val="PreprocessorTok"/>
-    <w:basedOn w:val="VerbatimChar"/>
-    <w:rPr>
-      <w:color w:val="bc7a00"/>
-    </w:rPr>
-  </w:style>
-  <w:style w:type="character" w:customStyle="1" w:styleId="AttributeTok">
-    <w:name w:val="AttributeTok"/>
-    <w:basedOn w:val="VerbatimChar"/>
-    <w:rPr>
-      <w:color w:val="7d9029"/>
-    </w:rPr>
-  </w:style>
-  <w:style w:type="character" w:customStyle="1" w:styleId="RegionMarkerTok">
-    <w:name w:val="RegionMarkerTok"/>
-    <w:basedOn w:val="VerbatimChar"/>
-    <w:rPr/>
-  </w:style>
-  <w:style w:type="character" w:customStyle="1" w:styleId="InformationTok">
-    <w:name w:val="InformationTok"/>
-    <w:basedOn w:val="VerbatimChar"/>
-    <w:rPr>
-      <w:b/>
-      <w:i/>
-      <w:color w:val="60a0b0"/>
-    </w:rPr>
-  </w:style>
-  <w:style w:type="character" w:customStyle="1" w:styleId="WarningTok">
-    <w:name w:val="WarningTok"/>
-    <w:basedOn w:val="VerbatimChar"/>
-    <w:rPr>
-      <w:b/>
-      <w:i/>
-      <w:color w:val="60a0b0"/>
-    </w:rPr>
-  </w:style>
-  <w:style w:type="character" w:customStyle="1" w:styleId="AlertTok">
-    <w:name w:val="AlertTok"/>
-    <w:basedOn w:val="VerbatimChar"/>
-    <w:rPr>
-      <w:b/>
-      <w:color w:val="ff0000"/>
-    </w:rPr>
-  </w:style>
-  <w:style w:type="character" w:customStyle="1" w:styleId="ErrorTok">
-    <w:name w:val="ErrorTok"/>
-    <w:basedOn w:val="VerbatimChar"/>
-    <w:rPr>
-      <w:b/>
-      <w:color w:val="ff0000"/>
-    </w:rPr>
-  </w:style>
-  <w:style w:type="character" w:customStyle="1" w:styleId="NormalTok">
-    <w:name w:val="NormalTok"/>
-    <w:basedOn w:val="VerbatimChar"/>
-    <w:rPr/>
+    <w:qFormat/>
+    <w:pPr>
+      <w:pBdr>
+        <w:top w:color="BFBFBF" w:space="4" w:sz="4" w:val="single"/>
+        <w:left w:color="BFBFBF" w:space="4" w:sz="4" w:val="single"/>
+        <w:bottom w:color="BFBFBF" w:space="4" w:sz="4" w:val="single"/>
+        <w:right w:color="BFBFBF" w:space="4" w:sz="4" w:val="single"/>
+      </w:pBdr>
+      <w:shd w:color="auto" w:fill="F4F4F4" w:val="clear"/>
+      <w:spacing w:after="120" w:before="120" w:line="200" w:lineRule="auto"/>
+      <w:ind w:firstLine="0" w:left="284" w:right="284"/>
+      <w:jc w:val="left"/>
+    </w:pPr>
+    <w:rPr>
+      <w:rFonts w:ascii="Courier New" w:cs="Courier New" w:eastAsia="Courier New" w:hAnsi="Courier New"/>
+      <w:sz w:val="18"/>
+      <w:szCs w:val="18"/>
+    </w:rPr>
   </w:style>
 </w:styles>
 </file>

</xml_diff>

<commit_message>
feat: add grading criteria pages and lab document generation scripts (#10)
- Implement dedicated grading criteria pages with hash routing support
- Add Lua filter and Pandoc template generator for lab .docx file creation
- Enhance roadmap navigation with course grading criteria links
- Update related content and hooks to include grading criteria functionality
- Refactor metadata and styling for lab descriptions and theoretical notes
</commit_message>
<xml_diff>
--- a/public/labs/os/Критерії_оцінювання_ОС.docx
+++ b/public/labs/os/Критерії_оцінювання_ОС.docx
@@ -34,6 +34,7 @@
           <w:ilvl w:val="0"/>
           <w:numId w:val="1001"/>
         </w:numPr>
+        <w:jc w:val="both"/>
       </w:pPr>
       <w:r>
         <w:t xml:space="preserve">усі пункти порядку виконання роботи виконано в повному обсязі, жодного не пропущено;</w:t>
@@ -46,6 +47,7 @@
           <w:ilvl w:val="0"/>
           <w:numId w:val="1001"/>
         </w:numPr>
+        <w:jc w:val="both"/>
       </w:pPr>
       <w:r>
         <w:t xml:space="preserve">завдання індивідуального варіанта виконано правильно; постановка задачі описана, вхідні та вихідні дані визначені;</w:t>
@@ -58,6 +60,7 @@
           <w:ilvl w:val="0"/>
           <w:numId w:val="1001"/>
         </w:numPr>
+        <w:jc w:val="both"/>
       </w:pPr>
       <w:r>
         <w:t xml:space="preserve">усі дії виконано тим способом, який передбачає робота, — командним рядком, командним файлом або сценарієм; графічний інтерфейс використано лише там, де це прямо зазначено в завданні;</w:t>
@@ -70,6 +73,7 @@
           <w:ilvl w:val="0"/>
           <w:numId w:val="1001"/>
         </w:numPr>
+        <w:jc w:val="both"/>
       </w:pPr>
       <w:r>
         <w:t xml:space="preserve">команди, командні файли та сценарії:</w:t>
@@ -82,6 +86,7 @@
           <w:ilvl w:val="1"/>
           <w:numId w:val="1002"/>
         </w:numPr>
+        <w:jc w:val="both"/>
       </w:pPr>
       <w:r>
         <w:t xml:space="preserve">виконуються без помилок і дають передбачений результат;</w:t>
@@ -94,6 +99,7 @@
           <w:ilvl w:val="1"/>
           <w:numId w:val="1002"/>
         </w:numPr>
+        <w:jc w:val="both"/>
       </w:pPr>
       <w:r>
         <w:t xml:space="preserve">містять перевірку вхідних даних і повідомлення про помилки, якщо це передбачено роботою;</w:t>
@@ -106,6 +112,7 @@
           <w:ilvl w:val="1"/>
           <w:numId w:val="1002"/>
         </w:numPr>
+        <w:jc w:val="both"/>
       </w:pPr>
       <w:r>
         <w:t xml:space="preserve">структуровані, з коментарями, зі змістовними іменами файлів, каталогів і змінних;</w:t>
@@ -118,6 +125,7 @@
           <w:ilvl w:val="0"/>
           <w:numId w:val="1001"/>
         </w:numPr>
+        <w:jc w:val="both"/>
       </w:pPr>
       <w:r>
         <w:t xml:space="preserve">проведено тестування з коректними і завідомо некоректними даними; наведено реакцію системи в обох випадках;</w:t>
@@ -130,6 +138,7 @@
           <w:ilvl w:val="0"/>
           <w:numId w:val="1001"/>
         </w:numPr>
+        <w:jc w:val="both"/>
       </w:pPr>
       <w:r>
         <w:t xml:space="preserve">результат кожного етапу підтверджено знімком екрана або виводом команди;</w:t>
@@ -142,6 +151,7 @@
           <w:ilvl w:val="0"/>
           <w:numId w:val="1001"/>
         </w:numPr>
+        <w:jc w:val="both"/>
       </w:pPr>
       <w:r>
         <w:t xml:space="preserve">студент пояснює призначення кожної виконаної команди і пов’язує отриманий результат із теоретичним матеріалом теми — ядром, процесами, режимами роботи процесора, файловою системою або правами доступу, залежно від змісту роботи;</w:t>
@@ -154,6 +164,7 @@
           <w:ilvl w:val="0"/>
           <w:numId w:val="1001"/>
         </w:numPr>
+        <w:jc w:val="both"/>
       </w:pPr>
       <w:r>
         <w:t xml:space="preserve">звіт оформлений повністю на бланку встановленого зразка: тема, мета, обладнання, постановка задачі, хід роботи з переліком команд і поясненням призначення кожної, знімки екрана, відповіді на контрольні запитання;</w:t>
@@ -166,6 +177,7 @@
           <w:ilvl w:val="0"/>
           <w:numId w:val="1001"/>
         </w:numPr>
+        <w:jc w:val="both"/>
       </w:pPr>
       <w:r>
         <w:t xml:space="preserve">зроблено змістовний висновок, який спирається на власні результати, а не переказує теорію;</w:t>
@@ -178,6 +190,7 @@
           <w:ilvl w:val="0"/>
           <w:numId w:val="1001"/>
         </w:numPr>
+        <w:jc w:val="both"/>
       </w:pPr>
       <w:r>
         <w:t xml:space="preserve">на захисті студент упевнено відповідає на контрольні запитання і на вимогу викладача повторює будь-яку дію з роботи.</w:t>
@@ -208,6 +221,7 @@
           <w:ilvl w:val="0"/>
           <w:numId w:val="1003"/>
         </w:numPr>
+        <w:jc w:val="both"/>
       </w:pPr>
       <w:r>
         <w:t xml:space="preserve">усі основні пункти виконано, пропущено окремі другорядні;</w:t>
@@ -220,6 +234,7 @@
           <w:ilvl w:val="0"/>
           <w:numId w:val="1003"/>
         </w:numPr>
+        <w:jc w:val="both"/>
       </w:pPr>
       <w:r>
         <w:t xml:space="preserve">завдання індивідуального варіанта виконано, проте постановка задачі описана без повної деталізації;</w:t>
@@ -232,6 +247,7 @@
           <w:ilvl w:val="0"/>
           <w:numId w:val="1003"/>
         </w:numPr>
+        <w:jc w:val="both"/>
       </w:pPr>
       <w:r>
         <w:t xml:space="preserve">окремі дії виконано засобами графічного інтерфейсу там, де передбачався командний рядок;</w:t>
@@ -244,6 +260,7 @@
           <w:ilvl w:val="0"/>
           <w:numId w:val="1003"/>
         </w:numPr>
+        <w:jc w:val="both"/>
       </w:pPr>
       <w:r>
         <w:t xml:space="preserve">команди, командні файли та сценарії працюють, але:</w:t>
@@ -256,6 +273,7 @@
           <w:ilvl w:val="1"/>
           <w:numId w:val="1004"/>
         </w:numPr>
+        <w:jc w:val="both"/>
       </w:pPr>
       <w:r>
         <w:t xml:space="preserve">бракує перевірки вхідних даних або повідомлень про помилки;</w:t>
@@ -268,6 +286,7 @@
           <w:ilvl w:val="1"/>
           <w:numId w:val="1004"/>
         </w:numPr>
+        <w:jc w:val="both"/>
       </w:pPr>
       <w:r>
         <w:t xml:space="preserve">трапляються дрібні неточності в ключах команд чи синтаксисі, які не впливають на кінцевий результат;</w:t>
@@ -280,6 +299,7 @@
           <w:ilvl w:val="1"/>
           <w:numId w:val="1004"/>
         </w:numPr>
+        <w:jc w:val="both"/>
       </w:pPr>
       <w:r>
         <w:t xml:space="preserve">коментарі відсутні або формальні;</w:t>
@@ -292,6 +312,7 @@
           <w:ilvl w:val="0"/>
           <w:numId w:val="1003"/>
         </w:numPr>
+        <w:jc w:val="both"/>
       </w:pPr>
       <w:r>
         <w:t xml:space="preserve">тестування проведено частково — лише на коректних даних;</w:t>
@@ -304,6 +325,7 @@
           <w:ilvl w:val="0"/>
           <w:numId w:val="1003"/>
         </w:numPr>
+        <w:jc w:val="both"/>
       </w:pPr>
       <w:r>
         <w:t xml:space="preserve">знімки екрана наведено не для всіх етапів роботи;</w:t>
@@ -316,6 +338,7 @@
           <w:ilvl w:val="0"/>
           <w:numId w:val="1003"/>
         </w:numPr>
+        <w:jc w:val="both"/>
       </w:pPr>
       <w:r>
         <w:t xml:space="preserve">студент пояснює свої дії, але зв’язок із теоретичним матеріалом поверхневий; призначення окремих команд пояснити не може;</w:t>
@@ -328,6 +351,7 @@
           <w:ilvl w:val="0"/>
           <w:numId w:val="1003"/>
         </w:numPr>
+        <w:jc w:val="both"/>
       </w:pPr>
       <w:r>
         <w:t xml:space="preserve">звіт оформлений, але без повної деталізації або без прикладів;</w:t>
@@ -340,6 +364,7 @@
           <w:ilvl w:val="0"/>
           <w:numId w:val="1003"/>
         </w:numPr>
+        <w:jc w:val="both"/>
       </w:pPr>
       <w:r>
         <w:t xml:space="preserve">висновок короткий чи загальний;</w:t>
@@ -352,6 +377,7 @@
           <w:ilvl w:val="0"/>
           <w:numId w:val="1003"/>
         </w:numPr>
+        <w:jc w:val="both"/>
       </w:pPr>
       <w:r>
         <w:t xml:space="preserve">на захисті відповідає на більшість запитань, окремі — лише з навідними запитаннями викладача.</w:t>
@@ -382,6 +408,7 @@
           <w:ilvl w:val="0"/>
           <w:numId w:val="1005"/>
         </w:numPr>
+        <w:jc w:val="both"/>
       </w:pPr>
       <w:r>
         <w:t xml:space="preserve">виконано лише частину пунктів порядку виконання роботи;</w:t>
@@ -394,6 +421,7 @@
           <w:ilvl w:val="0"/>
           <w:numId w:val="1005"/>
         </w:numPr>
+        <w:jc w:val="both"/>
       </w:pPr>
       <w:r>
         <w:t xml:space="preserve">завдання індивідуального варіанта виконано частково або підмінене типовим прикладом з методичних вказівок;</w:t>
@@ -406,6 +434,7 @@
           <w:ilvl w:val="0"/>
           <w:numId w:val="1005"/>
         </w:numPr>
+        <w:jc w:val="both"/>
       </w:pPr>
       <w:r>
         <w:t xml:space="preserve">більшість дій виконано засобами графічного інтерфейсу замість командного рядка;</w:t>
@@ -418,6 +447,7 @@
           <w:ilvl w:val="0"/>
           <w:numId w:val="1005"/>
         </w:numPr>
+        <w:jc w:val="both"/>
       </w:pPr>
       <w:r>
         <w:t xml:space="preserve">команди, командні файли та сценарії:</w:t>
@@ -430,6 +460,7 @@
           <w:ilvl w:val="1"/>
           <w:numId w:val="1006"/>
         </w:numPr>
+        <w:jc w:val="both"/>
       </w:pPr>
       <w:r>
         <w:t xml:space="preserve">працюють з помилками або лише в окремих випадках;</w:t>
@@ -442,6 +473,7 @@
           <w:ilvl w:val="1"/>
           <w:numId w:val="1006"/>
         </w:numPr>
+        <w:jc w:val="both"/>
       </w:pPr>
       <w:r>
         <w:t xml:space="preserve">не містять перевірок і обробки помилок;</w:t>
@@ -454,6 +486,7 @@
           <w:ilvl w:val="1"/>
           <w:numId w:val="1006"/>
         </w:numPr>
+        <w:jc w:val="both"/>
       </w:pPr>
       <w:r>
         <w:t xml:space="preserve">не структуровані, без коментарів;</w:t>
@@ -466,6 +499,7 @@
           <w:ilvl w:val="0"/>
           <w:numId w:val="1005"/>
         </w:numPr>
+        <w:jc w:val="both"/>
       </w:pPr>
       <w:r>
         <w:t xml:space="preserve">тестування не проведено;</w:t>
@@ -478,6 +512,7 @@
           <w:ilvl w:val="0"/>
           <w:numId w:val="1005"/>
         </w:numPr>
+        <w:jc w:val="both"/>
       </w:pPr>
       <w:r>
         <w:t xml:space="preserve">знімки екрана відсутні або не підтверджують заявлений результат;</w:t>
@@ -490,6 +525,7 @@
           <w:ilvl w:val="0"/>
           <w:numId w:val="1005"/>
         </w:numPr>
+        <w:jc w:val="both"/>
       </w:pPr>
       <w:r>
         <w:t xml:space="preserve">студент відтворює команди механічно, пояснити їх дію не може;</w:t>
@@ -502,6 +538,7 @@
           <w:ilvl w:val="0"/>
           <w:numId w:val="1005"/>
         </w:numPr>
+        <w:jc w:val="both"/>
       </w:pPr>
       <w:r>
         <w:t xml:space="preserve">звіт неповний або без належного оформлення;</w:t>
@@ -514,6 +551,7 @@
           <w:ilvl w:val="0"/>
           <w:numId w:val="1005"/>
         </w:numPr>
+        <w:jc w:val="both"/>
       </w:pPr>
       <w:r>
         <w:t xml:space="preserve">висновок формальний або відсутній;</w:t>
@@ -526,6 +564,7 @@
           <w:ilvl w:val="0"/>
           <w:numId w:val="1005"/>
         </w:numPr>
+        <w:jc w:val="both"/>
       </w:pPr>
       <w:r>
         <w:t xml:space="preserve">на захисті відповідає лише на окремі питання.</w:t>
@@ -533,9 +572,10 @@
     </w:p>
     <w:bookmarkEnd w:id="11"/>
     <w:sectPr>
-      <w:footnotePr>
-        <w:numRestart w:val="eachSect"/>
-      </w:footnotePr>
+      <w:pgSz w:h="16838" w:orient="portrait" w:w="11906"/>
+      <w:pgMar w:bottom="1134" w:footer="708" w:gutter="0" w:header="708" w:left="1418" w:right="851" w:top="1134"/>
+      <w:pgNumType w:start="1"/>
+      <w:docGrid w:linePitch="360"/>
     </w:sectPr>
   </w:body>
 </w:document>
@@ -571,74 +611,74 @@
     <w:multiLevelType w:val="multilevel"/>
     <w:lvl w:ilvl="0">
       <w:numFmt w:val="bullet"/>
-      <w:lvlText w:val=" "/>
+      <w:lvlText w:val="–"/>
       <w:lvlJc w:val="left"/>
       <w:pPr>
-        <w:ind w:left="720" w:hanging="360"/>
+        <w:ind w:left="1134" w:hanging="425"/>
       </w:pPr>
     </w:lvl>
     <w:lvl w:ilvl="1">
       <w:numFmt w:val="bullet"/>
-      <w:lvlText w:val=" "/>
+      <w:lvlText w:val="–"/>
       <w:lvlJc w:val="left"/>
       <w:pPr>
-        <w:ind w:left="1440" w:hanging="360"/>
+        <w:ind w:left="1701" w:hanging="425"/>
       </w:pPr>
     </w:lvl>
     <w:lvl w:ilvl="2">
       <w:numFmt w:val="bullet"/>
-      <w:lvlText w:val=" "/>
+      <w:lvlText w:val="–"/>
       <w:lvlJc w:val="left"/>
       <w:pPr>
-        <w:ind w:left="2160" w:hanging="360"/>
+        <w:ind w:left="2268" w:hanging="425"/>
       </w:pPr>
     </w:lvl>
     <w:lvl w:ilvl="3">
       <w:numFmt w:val="bullet"/>
-      <w:lvlText w:val=" "/>
+      <w:lvlText w:val="–"/>
       <w:lvlJc w:val="left"/>
       <w:pPr>
-        <w:ind w:left="2880" w:hanging="360"/>
+        <w:ind w:left="2835" w:hanging="425"/>
       </w:pPr>
     </w:lvl>
     <w:lvl w:ilvl="4">
       <w:numFmt w:val="bullet"/>
-      <w:lvlText w:val=" "/>
+      <w:lvlText w:val="–"/>
       <w:lvlJc w:val="left"/>
       <w:pPr>
-        <w:ind w:left="3600" w:hanging="360"/>
+        <w:ind w:left="3402" w:hanging="425"/>
       </w:pPr>
     </w:lvl>
     <w:lvl w:ilvl="5">
       <w:numFmt w:val="bullet"/>
-      <w:lvlText w:val=" "/>
+      <w:lvlText w:val="–"/>
       <w:lvlJc w:val="left"/>
       <w:pPr>
-        <w:ind w:left="4320" w:hanging="360"/>
+        <w:ind w:left="3969" w:hanging="425"/>
       </w:pPr>
     </w:lvl>
     <w:lvl w:ilvl="6">
       <w:numFmt w:val="bullet"/>
-      <w:lvlText w:val=" "/>
+      <w:lvlText w:val="–"/>
       <w:lvlJc w:val="left"/>
       <w:pPr>
-        <w:ind w:left="5040" w:hanging="360"/>
+        <w:ind w:left="4536" w:hanging="425"/>
       </w:pPr>
     </w:lvl>
     <w:lvl w:ilvl="7">
       <w:numFmt w:val="bullet"/>
-      <w:lvlText w:val=" "/>
+      <w:lvlText w:val="–"/>
       <w:lvlJc w:val="left"/>
       <w:pPr>
-        <w:ind w:left="5760" w:hanging="360"/>
+        <w:ind w:left="5103" w:hanging="425"/>
       </w:pPr>
     </w:lvl>
     <w:lvl w:ilvl="8">
       <w:numFmt w:val="bullet"/>
-      <w:lvlText w:val=" "/>
+      <w:lvlText w:val="–"/>
       <w:lvlJc w:val="left"/>
       <w:pPr>
-        <w:ind w:left="6480" w:hanging="360"/>
+        <w:ind w:left="5670" w:hanging="425"/>
       </w:pPr>
     </w:lvl>
   </w:abstractNum>
@@ -647,21 +687,19 @@
     <w:multiLevelType w:val="multilevel"/>
     <w:lvl w:ilvl="0">
       <w:numFmt w:val="bullet"/>
-      <w:lvlText w:val=""/>
+      <w:lvlText w:val="–"/>
       <w:lvlJc w:val="left"/>
       <w:pPr>
-        <w:ind w:left="720" w:hanging="360"/>
-      </w:pPr>
-      <w:rPr>
-        <w:rFonts w:ascii="Symbol" w:hAnsi="Symbol" w:cs="Symbol" w:hint="default"/>
-      </w:rPr>
+        <w:ind w:left="1134" w:hanging="425"/>
+      </w:pPr>
+      <w:rPr/>
     </w:lvl>
     <w:lvl w:ilvl="1">
       <w:numFmt w:val="bullet"/>
-      <w:lvlText w:val="o"/>
+      <w:lvlText w:val="–"/>
       <w:lvlJc w:val="left"/>
       <w:pPr>
-        <w:ind w:left="1440" w:hanging="360"/>
+        <w:ind w:left="1701" w:hanging="425"/>
       </w:pPr>
       <w:rPr>
         <w:rFonts w:ascii="Courier New" w:hAnsi="Courier New" w:cs="Courier New" w:hint="default"/>
@@ -669,32 +707,28 @@
     </w:lvl>
     <w:lvl w:ilvl="2">
       <w:numFmt w:val="bullet"/>
-      <w:lvlText w:val=""/>
+      <w:lvlText w:val="–"/>
       <w:lvlJc w:val="left"/>
       <w:pPr>
-        <w:ind w:left="2160" w:hanging="360"/>
-      </w:pPr>
-      <w:rPr>
-        <w:rFonts w:ascii="Wingdings" w:hAnsi="Wingdings" w:cs="Wingdings" w:hint="default"/>
-      </w:rPr>
+        <w:ind w:left="2268" w:hanging="425"/>
+      </w:pPr>
+      <w:rPr/>
     </w:lvl>
     <w:lvl w:ilvl="3">
       <w:numFmt w:val="bullet"/>
-      <w:lvlText w:val=""/>
+      <w:lvlText w:val="–"/>
       <w:lvlJc w:val="left"/>
       <w:pPr>
-        <w:ind w:left="2880" w:hanging="360"/>
-      </w:pPr>
-      <w:rPr>
-        <w:rFonts w:ascii="Symbol" w:hAnsi="Symbol" w:cs="Symbol" w:hint="default"/>
-      </w:rPr>
+        <w:ind w:left="2835" w:hanging="425"/>
+      </w:pPr>
+      <w:rPr/>
     </w:lvl>
     <w:lvl w:ilvl="4">
       <w:numFmt w:val="bullet"/>
-      <w:lvlText w:val="o"/>
+      <w:lvlText w:val="–"/>
       <w:lvlJc w:val="left"/>
       <w:pPr>
-        <w:ind w:left="3600" w:hanging="360"/>
+        <w:ind w:left="3402" w:hanging="425"/>
       </w:pPr>
       <w:rPr>
         <w:rFonts w:ascii="Courier New" w:hAnsi="Courier New" w:cs="Courier New" w:hint="default"/>
@@ -702,32 +736,28 @@
     </w:lvl>
     <w:lvl w:ilvl="5">
       <w:numFmt w:val="bullet"/>
-      <w:lvlText w:val=""/>
+      <w:lvlText w:val="–"/>
       <w:lvlJc w:val="left"/>
       <w:pPr>
-        <w:ind w:left="4320" w:hanging="360"/>
-      </w:pPr>
-      <w:rPr>
-        <w:rFonts w:ascii="Wingdings" w:hAnsi="Wingdings" w:cs="Wingdings" w:hint="default"/>
-      </w:rPr>
+        <w:ind w:left="3969" w:hanging="425"/>
+      </w:pPr>
+      <w:rPr/>
     </w:lvl>
     <w:lvl w:ilvl="6">
       <w:numFmt w:val="bullet"/>
-      <w:lvlText w:val=""/>
+      <w:lvlText w:val="–"/>
       <w:lvlJc w:val="left"/>
       <w:pPr>
-        <w:ind w:left="5040" w:hanging="360"/>
-      </w:pPr>
-      <w:rPr>
-        <w:rFonts w:ascii="Symbol" w:hAnsi="Symbol" w:cs="Symbol" w:hint="default"/>
-      </w:rPr>
+        <w:ind w:left="4536" w:hanging="425"/>
+      </w:pPr>
+      <w:rPr/>
     </w:lvl>
     <w:lvl w:ilvl="7">
       <w:numFmt w:val="bullet"/>
-      <w:lvlText w:val="o"/>
+      <w:lvlText w:val="–"/>
       <w:lvlJc w:val="left"/>
       <w:pPr>
-        <w:ind w:left="5760" w:hanging="360"/>
+        <w:ind w:left="5103" w:hanging="425"/>
       </w:pPr>
       <w:rPr>
         <w:rFonts w:ascii="Courier New" w:hAnsi="Courier New" w:cs="Courier New" w:hint="default"/>
@@ -735,14 +765,12 @@
     </w:lvl>
     <w:lvl w:ilvl="8">
       <w:numFmt w:val="bullet"/>
-      <w:lvlText w:val=""/>
+      <w:lvlText w:val="–"/>
       <w:lvlJc w:val="left"/>
       <w:pPr>
-        <w:ind w:left="6480" w:hanging="360"/>
-      </w:pPr>
-      <w:rPr>
-        <w:rFonts w:ascii="Wingdings" w:hAnsi="Wingdings" w:cs="Wingdings" w:hint="default"/>
-      </w:rPr>
+        <w:ind w:left="5670" w:hanging="425"/>
+      </w:pPr>
+      <w:rPr/>
     </w:lvl>
   </w:abstractNum>
   <w:num w:numId="1000">
@@ -774,15 +802,15 @@
   <w:docDefaults>
     <w:rPrDefault>
       <w:rPr>
-        <w:rFonts w:asciiTheme="minorHAnsi" w:cstheme="minorBidi" w:eastAsiaTheme="minorEastAsia" w:hAnsiTheme="minorHAnsi"/>
-        <w:sz w:val="24"/>
-        <w:szCs w:val="24"/>
-        <w:lang w:bidi="ar-SA" w:eastAsia="zh-CN" w:val="en-US"/>
+        <w:rFonts w:ascii="Times New Roman" w:cs="Times New Roman" w:eastAsia="Times New Roman" w:hAnsi="Times New Roman"/>
+        <w:sz w:val="28"/>
+        <w:szCs w:val="28"/>
+        <w:lang w:val="uk-UA"/>
       </w:rPr>
     </w:rPrDefault>
     <w:pPrDefault>
       <w:pPr>
-        <w:spacing w:after="200"/>
+        <w:spacing w:after="0" w:before="0" w:line="312" w:lineRule="auto"/>
       </w:pPr>
     </w:pPrDefault>
   </w:docDefaults>
@@ -790,14 +818,19 @@
   <w:style w:default="1" w:styleId="Normal" w:type="paragraph">
     <w:name w:val="Normal"/>
     <w:qFormat/>
+    <w:pPr>
+      <w:spacing w:after="0" w:before="0" w:line="312" w:lineRule="auto"/>
+      <w:jc w:val="left"/>
+    </w:pPr>
   </w:style>
   <w:style w:styleId="BodyText" w:type="paragraph">
     <w:name w:val="Body Text"/>
     <w:basedOn w:val="Normal"/>
-    <w:link w:val="BodyTextChar"/>
-    <w:qFormat/>
-    <w:pPr>
-      <w:spacing w:after="180" w:before="180"/>
+    <w:qFormat/>
+    <w:pPr>
+      <w:spacing w:after="0" w:before="0" w:line="312" w:lineRule="auto"/>
+      <w:ind w:firstLine="709"/>
+      <w:jc w:val="both"/>
     </w:pPr>
   </w:style>
   <w:style w:customStyle="1" w:styleId="FirstParagraph" w:type="paragraph">
@@ -808,29 +841,28 @@
   </w:style>
   <w:style w:customStyle="1" w:styleId="Compact" w:type="paragraph">
     <w:name w:val="Compact"/>
-    <w:basedOn w:val="BodyText"/>
-    <w:qFormat/>
-    <w:pPr>
-      <w:spacing w:after="36" w:before="36"/>
+    <w:basedOn w:val="Normal"/>
+    <w:qFormat/>
+    <w:pPr>
+      <w:spacing w:after="0" w:before="0" w:line="312" w:lineRule="auto"/>
+      <w:ind w:firstLine="0"/>
+      <w:contextualSpacing/>
     </w:pPr>
   </w:style>
   <w:style w:styleId="Title" w:type="paragraph">
     <w:name w:val="Title"/>
     <w:basedOn w:val="Normal"/>
-    <w:next w:val="BodyText"/>
-    <w:link w:val="TitleChar"/>
-    <w:uiPriority w:val="10"/>
-    <w:qFormat/>
-    <w:rsid w:val="00A10FD9"/>
-    <w:pPr>
-      <w:spacing w:after="80" w:line="240" w:lineRule="auto"/>
-      <w:contextualSpacing/>
+    <w:next w:val="Subtitle"/>
+    <w:qFormat/>
+    <w:pPr>
+      <w:spacing w:after="120" w:before="0" w:line="312" w:lineRule="auto"/>
+      <w:ind w:firstLine="0"/>
       <w:jc w:val="center"/>
     </w:pPr>
     <w:rPr>
-      <w:rFonts w:asciiTheme="majorHAnsi" w:cstheme="majorBidi" w:eastAsiaTheme="majorEastAsia" w:hAnsiTheme="majorHAnsi"/>
-      <w:sz w:val="56"/>
-      <w:szCs w:val="56"/>
+      <w:rFonts w:ascii="Times New Roman" w:cs="Times New Roman" w:eastAsia="Times New Roman" w:hAnsi="Times New Roman"/>
+      <w:sz w:val="28"/>
+      <w:szCs w:val="28"/>
     </w:rPr>
   </w:style>
   <w:style w:customStyle="1" w:styleId="TitleChar" w:type="character">
@@ -847,20 +879,19 @@
   </w:style>
   <w:style w:styleId="Subtitle" w:type="paragraph">
     <w:name w:val="Subtitle"/>
-    <w:basedOn w:val="Title"/>
-    <w:next w:val="BodyText"/>
-    <w:link w:val="SubtitleChar"/>
-    <w:uiPriority w:val="11"/>
-    <w:qFormat/>
-    <w:rsid w:val="00A10FD9"/>
-    <w:pPr>
-      <w:numPr>
-        <w:ilvl w:val="1"/>
-      </w:numPr>
-    </w:pPr>
-    <w:rPr>
-      <w:rFonts w:cstheme="majorBidi" w:eastAsiaTheme="majorEastAsia"/>
-      <w:spacing w:val="15"/>
+    <w:basedOn w:val="Normal"/>
+    <w:next w:val="FirstParagraph"/>
+    <w:qFormat/>
+    <w:pPr>
+      <w:spacing w:after="240" w:before="0" w:line="312" w:lineRule="auto"/>
+      <w:ind w:firstLine="0"/>
+      <w:jc w:val="center"/>
+    </w:pPr>
+    <w:rPr>
+      <w:rFonts w:ascii="Times New Roman" w:cs="Times New Roman" w:eastAsia="Times New Roman" w:hAnsi="Times New Roman"/>
+      <w:b/>
+      <w:bCs/>
+      <w:caps/>
       <w:sz w:val="28"/>
       <w:szCs w:val="28"/>
     </w:rPr>
@@ -950,66 +981,56 @@
   <w:style w:styleId="Heading1" w:type="paragraph">
     <w:name w:val="heading 1"/>
     <w:basedOn w:val="Normal"/>
-    <w:next w:val="BodyText"/>
-    <w:link w:val="Heading1Char"/>
-    <w:uiPriority w:val="9"/>
-    <w:qFormat/>
-    <w:rsid w:val="00A10FD9"/>
+    <w:next w:val="FirstParagraph"/>
+    <w:qFormat/>
     <w:pPr>
       <w:keepNext/>
-      <w:keepLines/>
-      <w:spacing w:after="80" w:before="360"/>
-      <w:outlineLvl w:val="0"/>
-    </w:pPr>
-    <w:rPr>
-      <w:rFonts w:asciiTheme="majorHAnsi" w:cstheme="majorBidi" w:eastAsiaTheme="majorEastAsia" w:hAnsiTheme="majorHAnsi"/>
-      <w:color w:themeColor="accent1" w:themeShade="BF" w:val="0F4761"/>
-      <w:sz w:val="40"/>
-      <w:szCs w:val="40"/>
+      <w:spacing w:after="120" w:before="240" w:line="312" w:lineRule="auto"/>
+      <w:ind w:firstLine="0"/>
+      <w:jc w:val="center"/>
+    </w:pPr>
+    <w:rPr>
+      <w:rFonts w:ascii="Times New Roman" w:cs="Times New Roman" w:eastAsia="Times New Roman" w:hAnsi="Times New Roman"/>
+      <w:b/>
+      <w:bCs/>
+      <w:sz w:val="28"/>
+      <w:szCs w:val="28"/>
     </w:rPr>
   </w:style>
   <w:style w:styleId="Heading2" w:type="paragraph">
     <w:name w:val="heading 2"/>
     <w:basedOn w:val="Normal"/>
-    <w:next w:val="BodyText"/>
-    <w:link w:val="Heading2Char"/>
-    <w:uiPriority w:val="9"/>
-    <w:semiHidden/>
-    <w:unhideWhenUsed/>
-    <w:qFormat/>
-    <w:rsid w:val="00A10FD9"/>
+    <w:next w:val="FirstParagraph"/>
+    <w:qFormat/>
     <w:pPr>
       <w:keepNext/>
-      <w:keepLines/>
-      <w:spacing w:after="80" w:before="160"/>
-      <w:outlineLvl w:val="1"/>
-    </w:pPr>
-    <w:rPr>
-      <w:rFonts w:asciiTheme="majorHAnsi" w:cstheme="majorBidi" w:eastAsiaTheme="majorEastAsia" w:hAnsiTheme="majorHAnsi"/>
-      <w:color w:themeColor="accent1" w:themeShade="BF" w:val="0F4761"/>
-      <w:sz w:val="32"/>
-      <w:szCs w:val="32"/>
+      <w:spacing w:after="120" w:before="240" w:line="312" w:lineRule="auto"/>
+      <w:ind w:firstLine="0"/>
+      <w:jc w:val="center"/>
+    </w:pPr>
+    <w:rPr>
+      <w:rFonts w:ascii="Times New Roman" w:cs="Times New Roman" w:eastAsia="Times New Roman" w:hAnsi="Times New Roman"/>
+      <w:b/>
+      <w:bCs/>
+      <w:sz w:val="28"/>
+      <w:szCs w:val="28"/>
     </w:rPr>
   </w:style>
   <w:style w:styleId="Heading3" w:type="paragraph">
     <w:name w:val="heading 3"/>
     <w:basedOn w:val="Normal"/>
-    <w:next w:val="BodyText"/>
-    <w:link w:val="Heading3Char"/>
-    <w:uiPriority w:val="9"/>
-    <w:semiHidden/>
-    <w:unhideWhenUsed/>
-    <w:qFormat/>
-    <w:rsid w:val="00A10FD9"/>
+    <w:next w:val="FirstParagraph"/>
+    <w:qFormat/>
     <w:pPr>
       <w:keepNext/>
-      <w:keepLines/>
-      <w:spacing w:after="80" w:before="160"/>
-      <w:outlineLvl w:val="2"/>
-    </w:pPr>
-    <w:rPr>
-      <w:rFonts w:cstheme="majorBidi" w:eastAsiaTheme="majorEastAsia"/>
-      <w:color w:themeColor="accent1" w:themeShade="BF" w:val="0F4761"/>
+      <w:spacing w:after="0" w:before="140" w:line="312" w:lineRule="auto"/>
+      <w:ind w:firstLine="709"/>
+      <w:jc w:val="left"/>
+    </w:pPr>
+    <w:rPr>
+      <w:rFonts w:ascii="Times New Roman" w:cs="Times New Roman" w:eastAsia="Times New Roman" w:hAnsi="Times New Roman"/>
+      <w:b/>
+      <w:bCs/>
       <w:sz w:val="28"/>
       <w:szCs w:val="28"/>
     </w:rPr>
@@ -1017,68 +1038,58 @@
   <w:style w:styleId="Heading4" w:type="paragraph">
     <w:name w:val="heading 4"/>
     <w:basedOn w:val="Normal"/>
-    <w:next w:val="BodyText"/>
-    <w:link w:val="Heading4Char"/>
-    <w:uiPriority w:val="9"/>
-    <w:semiHidden/>
-    <w:unhideWhenUsed/>
-    <w:qFormat/>
-    <w:rsid w:val="00A10FD9"/>
+    <w:next w:val="FirstParagraph"/>
+    <w:qFormat/>
     <w:pPr>
       <w:keepNext/>
-      <w:keepLines/>
-      <w:spacing w:after="40" w:before="80"/>
-      <w:outlineLvl w:val="3"/>
-    </w:pPr>
-    <w:rPr>
-      <w:rFonts w:cstheme="majorBidi" w:eastAsiaTheme="majorEastAsia"/>
-      <w:i/>
-      <w:iCs/>
-      <w:color w:themeColor="accent1" w:themeShade="BF" w:val="0F4761"/>
+      <w:spacing w:after="0" w:before="120" w:line="312" w:lineRule="auto"/>
+      <w:ind w:firstLine="709"/>
+      <w:jc w:val="left"/>
+    </w:pPr>
+    <w:rPr>
+      <w:rFonts w:ascii="Times New Roman" w:cs="Times New Roman" w:eastAsia="Times New Roman" w:hAnsi="Times New Roman"/>
+      <w:b/>
+      <w:bCs/>
+      <w:sz w:val="28"/>
+      <w:szCs w:val="28"/>
     </w:rPr>
   </w:style>
   <w:style w:styleId="Heading5" w:type="paragraph">
     <w:name w:val="heading 5"/>
     <w:basedOn w:val="Normal"/>
-    <w:next w:val="BodyText"/>
-    <w:link w:val="Heading5Char"/>
-    <w:uiPriority w:val="9"/>
-    <w:semiHidden/>
-    <w:unhideWhenUsed/>
-    <w:qFormat/>
-    <w:rsid w:val="00A10FD9"/>
+    <w:next w:val="FirstParagraph"/>
+    <w:qFormat/>
     <w:pPr>
       <w:keepNext/>
-      <w:keepLines/>
-      <w:spacing w:after="40" w:before="80"/>
-      <w:outlineLvl w:val="4"/>
-    </w:pPr>
-    <w:rPr>
-      <w:rFonts w:cstheme="majorBidi" w:eastAsiaTheme="majorEastAsia"/>
-      <w:color w:themeColor="accent1" w:themeShade="BF" w:val="0F4761"/>
+      <w:spacing w:after="0" w:before="120" w:line="312" w:lineRule="auto"/>
+      <w:ind w:firstLine="709"/>
+      <w:jc w:val="left"/>
+    </w:pPr>
+    <w:rPr>
+      <w:rFonts w:ascii="Times New Roman" w:cs="Times New Roman" w:eastAsia="Times New Roman" w:hAnsi="Times New Roman"/>
+      <w:b/>
+      <w:bCs/>
+      <w:sz w:val="28"/>
+      <w:szCs w:val="28"/>
     </w:rPr>
   </w:style>
   <w:style w:styleId="Heading6" w:type="paragraph">
     <w:name w:val="heading 6"/>
     <w:basedOn w:val="Normal"/>
-    <w:next w:val="BodyText"/>
-    <w:link w:val="Heading6Char"/>
-    <w:uiPriority w:val="9"/>
-    <w:semiHidden/>
-    <w:unhideWhenUsed/>
-    <w:qFormat/>
-    <w:rsid w:val="00A10FD9"/>
+    <w:next w:val="FirstParagraph"/>
+    <w:qFormat/>
     <w:pPr>
       <w:keepNext/>
-      <w:keepLines/>
-      <w:spacing w:after="0" w:before="40"/>
-      <w:outlineLvl w:val="5"/>
-    </w:pPr>
-    <w:rPr>
-      <w:rFonts w:cstheme="majorBidi" w:eastAsiaTheme="majorEastAsia"/>
-      <w:i/>
-      <w:iCs/>
-      <w:color w:themeColor="text1" w:themeTint="A6" w:val="595959"/>
+      <w:spacing w:after="0" w:before="120" w:line="312" w:lineRule="auto"/>
+      <w:ind w:firstLine="709"/>
+      <w:jc w:val="left"/>
+    </w:pPr>
+    <w:rPr>
+      <w:rFonts w:ascii="Times New Roman" w:cs="Times New Roman" w:eastAsia="Times New Roman" w:hAnsi="Times New Roman"/>
+      <w:b/>
+      <w:bCs/>
+      <w:sz w:val="28"/>
+      <w:szCs w:val="28"/>
     </w:rPr>
   </w:style>
   <w:style w:styleId="Heading7" w:type="paragraph">
@@ -1268,13 +1279,10 @@
   <w:style w:styleId="BlockText" w:type="paragraph">
     <w:name w:val="Block Text"/>
     <w:basedOn w:val="BodyText"/>
-    <w:next w:val="BodyText"/>
-    <w:uiPriority w:val="9"/>
-    <w:unhideWhenUsed/>
-    <w:qFormat/>
-    <w:pPr>
-      <w:spacing w:after="100" w:before="100"/>
-      <w:ind w:firstLine="0" w:left="480" w:right="480"/>
+    <w:qFormat/>
+    <w:pPr>
+      <w:spacing w:after="0" w:before="0" w:line="312" w:lineRule="auto"/>
+      <w:ind w:firstLine="0" w:left="1134"/>
     </w:pPr>
   </w:style>
   <w:style w:styleId="FootnoteText" w:type="paragraph">
@@ -1305,24 +1313,44 @@
   <w:style w:default="1" w:styleId="Table" w:type="table">
     <w:name w:val="Table"/>
     <w:basedOn w:val="TableNormal"/>
-    <w:semiHidden/>
-    <w:unhideWhenUsed/>
-    <w:qFormat/>
+    <w:qFormat/>
+    <w:pPr>
+      <w:spacing w:after="0" w:before="0" w:line="240" w:lineRule="auto"/>
+      <w:ind w:firstLine="0"/>
+      <w:jc w:val="left"/>
+    </w:pPr>
+    <w:rPr>
+      <w:rFonts w:ascii="Times New Roman" w:cs="Times New Roman" w:eastAsia="Times New Roman" w:hAnsi="Times New Roman"/>
+      <w:sz w:val="24"/>
+      <w:szCs w:val="24"/>
+    </w:rPr>
     <w:tblPr>
       <w:tblInd w:type="dxa" w:w="0"/>
+      <w:tblBorders>
+        <w:top w:color="000000" w:space="0" w:sz="4" w:val="single"/>
+        <w:left w:color="000000" w:space="0" w:sz="4" w:val="single"/>
+        <w:bottom w:color="000000" w:space="0" w:sz="4" w:val="single"/>
+        <w:right w:color="000000" w:space="0" w:sz="4" w:val="single"/>
+        <w:insideH w:color="000000" w:space="0" w:sz="4" w:val="single"/>
+        <w:insideV w:color="000000" w:space="0" w:sz="4" w:val="single"/>
+      </w:tblBorders>
       <w:tblCellMar>
-        <w:top w:type="dxa" w:w="0"/>
-        <w:left w:type="dxa" w:w="108"/>
-        <w:bottom w:type="dxa" w:w="0"/>
-        <w:right w:type="dxa" w:w="108"/>
+        <w:top w:type="dxa" w:w="40"/>
+        <w:left w:type="dxa" w:w="70"/>
+        <w:bottom w:type="dxa" w:w="40"/>
+        <w:right w:type="dxa" w:w="70"/>
       </w:tblCellMar>
     </w:tblPr>
     <w:tblStylePr w:type="firstRow">
+      <w:pPr>
+        <w:jc w:val="center"/>
+      </w:pPr>
+      <w:rPr>
+        <w:b/>
+        <w:bCs/>
+      </w:rPr>
       <w:tcPr>
-        <w:tcBorders>
-          <w:bottom w:val="single"/>
-        </w:tcBorders>
-        <w:vAlign w:val="bottom"/>
+        <w:vAlign w:val="center"/>
       </w:tcPr>
     </w:tblStylePr>
   </w:style>
@@ -1356,18 +1384,48 @@
   </w:style>
   <w:style w:customStyle="1" w:styleId="TableCaption" w:type="paragraph">
     <w:name w:val="Table Caption"/>
-    <w:basedOn w:val="Caption"/>
+    <w:basedOn w:val="Normal"/>
+    <w:next w:val="FirstParagraph"/>
+    <w:qFormat/>
     <w:pPr>
       <w:keepNext/>
-    </w:pPr>
+      <w:spacing w:after="60" w:before="160" w:line="312" w:lineRule="auto"/>
+      <w:ind w:firstLine="0"/>
+      <w:jc w:val="center"/>
+    </w:pPr>
+    <w:rPr>
+      <w:rFonts w:ascii="Times New Roman" w:cs="Times New Roman" w:eastAsia="Times New Roman" w:hAnsi="Times New Roman"/>
+      <w:sz w:val="28"/>
+      <w:szCs w:val="28"/>
+    </w:rPr>
   </w:style>
   <w:style w:customStyle="1" w:styleId="ImageCaption" w:type="paragraph">
     <w:name w:val="Image Caption"/>
-    <w:basedOn w:val="Caption"/>
+    <w:basedOn w:val="Normal"/>
+    <w:next w:val="FirstParagraph"/>
+    <w:qFormat/>
+    <w:pPr>
+      <w:spacing w:after="160" w:before="60" w:line="312" w:lineRule="auto"/>
+      <w:ind w:firstLine="0"/>
+      <w:jc w:val="center"/>
+    </w:pPr>
+    <w:rPr>
+      <w:rFonts w:ascii="Times New Roman" w:cs="Times New Roman" w:eastAsia="Times New Roman" w:hAnsi="Times New Roman"/>
+      <w:sz w:val="28"/>
+      <w:szCs w:val="28"/>
+    </w:rPr>
   </w:style>
   <w:style w:customStyle="1" w:styleId="Figure" w:type="paragraph">
     <w:name w:val="Figure"/>
     <w:basedOn w:val="Normal"/>
+    <w:next w:val="ImageCaption"/>
+    <w:qFormat/>
+    <w:pPr>
+      <w:keepNext/>
+      <w:spacing w:after="60" w:before="160" w:line="312" w:lineRule="auto"/>
+      <w:ind w:firstLine="0"/>
+      <w:jc w:val="center"/>
+    </w:pPr>
   </w:style>
   <w:style w:customStyle="1" w:styleId="CaptionedFigure" w:type="paragraph">
     <w:name w:val="Captioned Figure"/>
@@ -1383,10 +1441,9 @@
   </w:style>
   <w:style w:customStyle="1" w:styleId="VerbatimChar" w:type="character">
     <w:name w:val="Verbatim Char"/>
-    <w:basedOn w:val="BodyTextChar"/>
-    <w:rPr>
-      <w:rFonts w:ascii="Consolas" w:hAnsi="Consolas"/>
-      <w:sz w:val="22"/>
+    <w:basedOn w:val="DefaultParagraphFont"/>
+    <w:rPr>
+      <w:rFonts w:ascii="Times New Roman" w:cs="Times New Roman" w:eastAsia="Times New Roman" w:hAnsi="Times New Roman"/>
     </w:rPr>
   </w:style>
   <w:style w:customStyle="1" w:styleId="SectionNumber" w:type="character">
@@ -1425,239 +1482,27 @@
       <w:color w:themeColor="accent1" w:themeShade="BF" w:val="365F91"/>
     </w:rPr>
   </w:style>
-  <w:style w:type="paragraph" w:customStyle="1" w:styleId="SourceCode">
+  <w:style w:customStyle="1" w:styleId="SourceCode" w:type="paragraph">
     <w:name w:val="Source Code"/>
     <w:basedOn w:val="Normal"/>
-    <w:link w:val="VerbatimChar"/>
-    <w:pPr>
-      <w:wordWrap w:val="off"/>
-    </w:pPr>
-  </w:style>
-  <w:style w:type="character" w:customStyle="1" w:styleId="KeywordTok">
-    <w:name w:val="KeywordTok"/>
-    <w:basedOn w:val="VerbatimChar"/>
-    <w:rPr>
-      <w:b/>
-      <w:color w:val="007020"/>
-    </w:rPr>
-  </w:style>
-  <w:style w:type="character" w:customStyle="1" w:styleId="DataTypeTok">
-    <w:name w:val="DataTypeTok"/>
-    <w:basedOn w:val="VerbatimChar"/>
-    <w:rPr>
-      <w:color w:val="902000"/>
-    </w:rPr>
-  </w:style>
-  <w:style w:type="character" w:customStyle="1" w:styleId="DecValTok">
-    <w:name w:val="DecValTok"/>
-    <w:basedOn w:val="VerbatimChar"/>
-    <w:rPr>
-      <w:color w:val="40a070"/>
-    </w:rPr>
-  </w:style>
-  <w:style w:type="character" w:customStyle="1" w:styleId="BaseNTok">
-    <w:name w:val="BaseNTok"/>
-    <w:basedOn w:val="VerbatimChar"/>
-    <w:rPr>
-      <w:color w:val="40a070"/>
-    </w:rPr>
-  </w:style>
-  <w:style w:type="character" w:customStyle="1" w:styleId="FloatTok">
-    <w:name w:val="FloatTok"/>
-    <w:basedOn w:val="VerbatimChar"/>
-    <w:rPr>
-      <w:color w:val="40a070"/>
-    </w:rPr>
-  </w:style>
-  <w:style w:type="character" w:customStyle="1" w:styleId="ConstantTok">
-    <w:name w:val="ConstantTok"/>
-    <w:basedOn w:val="VerbatimChar"/>
-    <w:rPr>
-      <w:color w:val="880000"/>
-    </w:rPr>
-  </w:style>
-  <w:style w:type="character" w:customStyle="1" w:styleId="CharTok">
-    <w:name w:val="CharTok"/>
-    <w:basedOn w:val="VerbatimChar"/>
-    <w:rPr>
-      <w:color w:val="4070a0"/>
-    </w:rPr>
-  </w:style>
-  <w:style w:type="character" w:customStyle="1" w:styleId="SpecialCharTok">
-    <w:name w:val="SpecialCharTok"/>
-    <w:basedOn w:val="VerbatimChar"/>
-    <w:rPr>
-      <w:color w:val="4070a0"/>
-    </w:rPr>
-  </w:style>
-  <w:style w:type="character" w:customStyle="1" w:styleId="StringTok">
-    <w:name w:val="StringTok"/>
-    <w:basedOn w:val="VerbatimChar"/>
-    <w:rPr>
-      <w:color w:val="4070a0"/>
-    </w:rPr>
-  </w:style>
-  <w:style w:type="character" w:customStyle="1" w:styleId="VerbatimStringTok">
-    <w:name w:val="VerbatimStringTok"/>
-    <w:basedOn w:val="VerbatimChar"/>
-    <w:rPr>
-      <w:color w:val="4070a0"/>
-    </w:rPr>
-  </w:style>
-  <w:style w:type="character" w:customStyle="1" w:styleId="SpecialStringTok">
-    <w:name w:val="SpecialStringTok"/>
-    <w:basedOn w:val="VerbatimChar"/>
-    <w:rPr>
-      <w:color w:val="bb6688"/>
-    </w:rPr>
-  </w:style>
-  <w:style w:type="character" w:customStyle="1" w:styleId="ImportTok">
-    <w:name w:val="ImportTok"/>
-    <w:basedOn w:val="VerbatimChar"/>
-    <w:rPr>
-      <w:b/>
-      <w:color w:val="008000"/>
-    </w:rPr>
-  </w:style>
-  <w:style w:type="character" w:customStyle="1" w:styleId="CommentTok">
-    <w:name w:val="CommentTok"/>
-    <w:basedOn w:val="VerbatimChar"/>
-    <w:rPr>
-      <w:i/>
-      <w:color w:val="60a0b0"/>
-    </w:rPr>
-  </w:style>
-  <w:style w:type="character" w:customStyle="1" w:styleId="DocumentationTok">
-    <w:name w:val="DocumentationTok"/>
-    <w:basedOn w:val="VerbatimChar"/>
-    <w:rPr>
-      <w:i/>
-      <w:color w:val="ba2121"/>
-    </w:rPr>
-  </w:style>
-  <w:style w:type="character" w:customStyle="1" w:styleId="AnnotationTok">
-    <w:name w:val="AnnotationTok"/>
-    <w:basedOn w:val="VerbatimChar"/>
-    <w:rPr>
-      <w:b/>
-      <w:i/>
-      <w:color w:val="60a0b0"/>
-    </w:rPr>
-  </w:style>
-  <w:style w:type="character" w:customStyle="1" w:styleId="CommentVarTok">
-    <w:name w:val="CommentVarTok"/>
-    <w:basedOn w:val="VerbatimChar"/>
-    <w:rPr>
-      <w:b/>
-      <w:i/>
-      <w:color w:val="60a0b0"/>
-    </w:rPr>
-  </w:style>
-  <w:style w:type="character" w:customStyle="1" w:styleId="OtherTok">
-    <w:name w:val="OtherTok"/>
-    <w:basedOn w:val="VerbatimChar"/>
-    <w:rPr>
-      <w:color w:val="007020"/>
-    </w:rPr>
-  </w:style>
-  <w:style w:type="character" w:customStyle="1" w:styleId="FunctionTok">
-    <w:name w:val="FunctionTok"/>
-    <w:basedOn w:val="VerbatimChar"/>
-    <w:rPr>
-      <w:color w:val="06287e"/>
-    </w:rPr>
-  </w:style>
-  <w:style w:type="character" w:customStyle="1" w:styleId="VariableTok">
-    <w:name w:val="VariableTok"/>
-    <w:basedOn w:val="VerbatimChar"/>
-    <w:rPr>
-      <w:color w:val="19177c"/>
-    </w:rPr>
-  </w:style>
-  <w:style w:type="character" w:customStyle="1" w:styleId="ControlFlowTok">
-    <w:name w:val="ControlFlowTok"/>
-    <w:basedOn w:val="VerbatimChar"/>
-    <w:rPr>
-      <w:b/>
-      <w:color w:val="007020"/>
-    </w:rPr>
-  </w:style>
-  <w:style w:type="character" w:customStyle="1" w:styleId="OperatorTok">
-    <w:name w:val="OperatorTok"/>
-    <w:basedOn w:val="VerbatimChar"/>
-    <w:rPr>
-      <w:color w:val="666666"/>
-    </w:rPr>
-  </w:style>
-  <w:style w:type="character" w:customStyle="1" w:styleId="BuiltInTok">
-    <w:name w:val="BuiltInTok"/>
-    <w:basedOn w:val="VerbatimChar"/>
-    <w:rPr>
-      <w:color w:val="008000"/>
-    </w:rPr>
-  </w:style>
-  <w:style w:type="character" w:customStyle="1" w:styleId="ExtensionTok">
-    <w:name w:val="ExtensionTok"/>
-    <w:basedOn w:val="VerbatimChar"/>
-    <w:rPr/>
-  </w:style>
-  <w:style w:type="character" w:customStyle="1" w:styleId="PreprocessorTok">
-    <w:name w:val="PreprocessorTok"/>
-    <w:basedOn w:val="VerbatimChar"/>
-    <w:rPr>
-      <w:color w:val="bc7a00"/>
-    </w:rPr>
-  </w:style>
-  <w:style w:type="character" w:customStyle="1" w:styleId="AttributeTok">
-    <w:name w:val="AttributeTok"/>
-    <w:basedOn w:val="VerbatimChar"/>
-    <w:rPr>
-      <w:color w:val="7d9029"/>
-    </w:rPr>
-  </w:style>
-  <w:style w:type="character" w:customStyle="1" w:styleId="RegionMarkerTok">
-    <w:name w:val="RegionMarkerTok"/>
-    <w:basedOn w:val="VerbatimChar"/>
-    <w:rPr/>
-  </w:style>
-  <w:style w:type="character" w:customStyle="1" w:styleId="InformationTok">
-    <w:name w:val="InformationTok"/>
-    <w:basedOn w:val="VerbatimChar"/>
-    <w:rPr>
-      <w:b/>
-      <w:i/>
-      <w:color w:val="60a0b0"/>
-    </w:rPr>
-  </w:style>
-  <w:style w:type="character" w:customStyle="1" w:styleId="WarningTok">
-    <w:name w:val="WarningTok"/>
-    <w:basedOn w:val="VerbatimChar"/>
-    <w:rPr>
-      <w:b/>
-      <w:i/>
-      <w:color w:val="60a0b0"/>
-    </w:rPr>
-  </w:style>
-  <w:style w:type="character" w:customStyle="1" w:styleId="AlertTok">
-    <w:name w:val="AlertTok"/>
-    <w:basedOn w:val="VerbatimChar"/>
-    <w:rPr>
-      <w:b/>
-      <w:color w:val="ff0000"/>
-    </w:rPr>
-  </w:style>
-  <w:style w:type="character" w:customStyle="1" w:styleId="ErrorTok">
-    <w:name w:val="ErrorTok"/>
-    <w:basedOn w:val="VerbatimChar"/>
-    <w:rPr>
-      <w:b/>
-      <w:color w:val="ff0000"/>
-    </w:rPr>
-  </w:style>
-  <w:style w:type="character" w:customStyle="1" w:styleId="NormalTok">
-    <w:name w:val="NormalTok"/>
-    <w:basedOn w:val="VerbatimChar"/>
-    <w:rPr/>
+    <w:qFormat/>
+    <w:pPr>
+      <w:pBdr>
+        <w:top w:color="BFBFBF" w:space="4" w:sz="4" w:val="single"/>
+        <w:left w:color="BFBFBF" w:space="4" w:sz="4" w:val="single"/>
+        <w:bottom w:color="BFBFBF" w:space="4" w:sz="4" w:val="single"/>
+        <w:right w:color="BFBFBF" w:space="4" w:sz="4" w:val="single"/>
+      </w:pBdr>
+      <w:shd w:color="auto" w:fill="F4F4F4" w:val="clear"/>
+      <w:spacing w:after="120" w:before="120" w:line="200" w:lineRule="auto"/>
+      <w:ind w:firstLine="0" w:left="284" w:right="284"/>
+      <w:jc w:val="left"/>
+    </w:pPr>
+    <w:rPr>
+      <w:rFonts w:ascii="Courier New" w:cs="Courier New" w:eastAsia="Courier New" w:hAnsi="Courier New"/>
+      <w:sz w:val="18"/>
+      <w:szCs w:val="18"/>
+    </w:rPr>
   </w:style>
 </w:styles>
 </file>

</xml_diff>